<commit_message>
added new css and update html files
</commit_message>
<xml_diff>
--- a/JavaAndAll/algoritmes.docx
+++ b/JavaAndAll/algoritmes.docx
@@ -2086,7 +2086,6 @@
           <w:spacing w:val="0"/>
           <w:sz w:val="0"/>
           <w:szCs w:val="0"/>
-          <w:bdr w:val="none" w:color="auto" w:sz="0" w:space="0"/>
           <w:shd w:val="clear" w:fill="F2F2F2"/>
         </w:rPr>
         <w:t>src</w:t>
@@ -2731,6 +2730,7 @@
     <w:p>
       <w:pPr>
         <w:numPr>
+          <w:ilvl w:val="0"/>
           <w:numId w:val="0"/>
         </w:numPr>
         <w:rPr>
@@ -2746,6 +2746,1621 @@
           <w:lang w:val="en-US"/>
         </w:rPr>
       </w:pPr>
+    </w:p>
+    <w:p>
+      <w:pPr>
+        <w:numPr>
+          <w:ilvl w:val="0"/>
+          <w:numId w:val="0"/>
+        </w:numPr>
+        <w:rPr>
+          <w:rFonts w:hint="default" w:ascii="Trebuchet MS" w:hAnsi="Trebuchet MS" w:eastAsia="SimSun" w:cs="Trebuchet MS"/>
+          <w:i w:val="0"/>
+          <w:iCs w:val="0"/>
+          <w:caps w:val="0"/>
+          <w:color w:val="303030"/>
+          <w:spacing w:val="0"/>
+          <w:sz w:val="21"/>
+          <w:szCs w:val="21"/>
+          <w:shd w:val="clear" w:fill="FFFFFF"/>
+          <w:lang w:val="ru-RU"/>
+        </w:rPr>
+      </w:pPr>
+      <w:r>
+        <w:rPr>
+          <w:rFonts w:hint="default" w:ascii="Trebuchet MS" w:hAnsi="Trebuchet MS" w:eastAsia="SimSun" w:cs="Trebuchet MS"/>
+          <w:i w:val="0"/>
+          <w:iCs w:val="0"/>
+          <w:caps w:val="0"/>
+          <w:color w:val="303030"/>
+          <w:spacing w:val="0"/>
+          <w:sz w:val="21"/>
+          <w:szCs w:val="21"/>
+          <w:shd w:val="clear" w:fill="FFFFFF"/>
+          <w:lang w:val="ru-RU"/>
+        </w:rPr>
+        <w:t>Заголовки и текст</w:t>
+      </w:r>
+    </w:p>
+    <w:p>
+      <w:pPr>
+        <w:numPr>
+          <w:ilvl w:val="0"/>
+          <w:numId w:val="0"/>
+        </w:numPr>
+        <w:rPr>
+          <w:rFonts w:hint="default" w:ascii="Trebuchet MS" w:hAnsi="Trebuchet MS" w:eastAsia="SimSun" w:cs="Trebuchet MS"/>
+          <w:i w:val="0"/>
+          <w:iCs w:val="0"/>
+          <w:caps w:val="0"/>
+          <w:color w:val="303030"/>
+          <w:spacing w:val="0"/>
+          <w:sz w:val="21"/>
+          <w:szCs w:val="21"/>
+          <w:shd w:val="clear" w:fill="FFFFFF"/>
+          <w:lang w:val="en-US"/>
+        </w:rPr>
+      </w:pPr>
+      <w:r>
+        <w:rPr>
+          <w:rFonts w:hint="default" w:ascii="Trebuchet MS" w:hAnsi="Trebuchet MS" w:eastAsia="SimSun" w:cs="Trebuchet MS"/>
+          <w:i w:val="0"/>
+          <w:iCs w:val="0"/>
+          <w:caps w:val="0"/>
+          <w:color w:val="303030"/>
+          <w:spacing w:val="0"/>
+          <w:sz w:val="21"/>
+          <w:szCs w:val="21"/>
+          <w:shd w:val="clear" w:fill="FFFFFF"/>
+          <w:lang w:val="en-US"/>
+        </w:rPr>
+        <w:t>&lt;h1&gt;&lt;h6&gt;</w:t>
+      </w:r>
+    </w:p>
+    <w:p>
+      <w:pPr>
+        <w:numPr>
+          <w:ilvl w:val="0"/>
+          <w:numId w:val="0"/>
+        </w:numPr>
+        <w:rPr>
+          <w:rFonts w:hint="default" w:ascii="Trebuchet MS" w:hAnsi="Trebuchet MS" w:eastAsia="SimSun" w:cs="Trebuchet MS"/>
+          <w:i w:val="0"/>
+          <w:iCs w:val="0"/>
+          <w:caps w:val="0"/>
+          <w:color w:val="303030"/>
+          <w:spacing w:val="0"/>
+          <w:sz w:val="21"/>
+          <w:szCs w:val="21"/>
+          <w:shd w:val="clear" w:fill="FFFFFF"/>
+          <w:lang w:val="en-US"/>
+        </w:rPr>
+      </w:pPr>
+      <w:r>
+        <w:rPr>
+          <w:rFonts w:hint="default" w:ascii="Trebuchet MS" w:hAnsi="Trebuchet MS" w:eastAsia="SimSun" w:cs="Trebuchet MS"/>
+          <w:i w:val="0"/>
+          <w:iCs w:val="0"/>
+          <w:caps w:val="0"/>
+          <w:color w:val="303030"/>
+          <w:spacing w:val="0"/>
+          <w:sz w:val="21"/>
+          <w:szCs w:val="21"/>
+          <w:shd w:val="clear" w:fill="FFFFFF"/>
+          <w:lang w:val="en-US"/>
+        </w:rPr>
+        <w:t>&lt;/h1&gt;&lt;/h6&gt;</w:t>
+      </w:r>
+    </w:p>
+    <w:p>
+      <w:pPr>
+        <w:numPr>
+          <w:ilvl w:val="0"/>
+          <w:numId w:val="0"/>
+        </w:numPr>
+        <w:rPr>
+          <w:rFonts w:hint="default" w:ascii="Trebuchet MS" w:hAnsi="Trebuchet MS" w:eastAsia="SimSun" w:cs="Trebuchet MS"/>
+          <w:i w:val="0"/>
+          <w:iCs w:val="0"/>
+          <w:caps w:val="0"/>
+          <w:color w:val="303030"/>
+          <w:spacing w:val="0"/>
+          <w:sz w:val="21"/>
+          <w:szCs w:val="21"/>
+          <w:shd w:val="clear" w:fill="FFFFFF"/>
+          <w:lang w:val="en-US"/>
+        </w:rPr>
+      </w:pPr>
+      <w:r>
+        <w:rPr>
+          <w:rFonts w:hint="default" w:ascii="Trebuchet MS" w:hAnsi="Trebuchet MS" w:eastAsia="SimSun" w:cs="Trebuchet MS"/>
+          <w:i w:val="0"/>
+          <w:iCs w:val="0"/>
+          <w:caps w:val="0"/>
+          <w:color w:val="303030"/>
+          <w:spacing w:val="0"/>
+          <w:sz w:val="21"/>
+          <w:szCs w:val="21"/>
+          <w:shd w:val="clear" w:fill="FFFFFF"/>
+          <w:lang w:val="en-US"/>
+        </w:rPr>
+        <w:t>&lt;p&gt;&lt;/p&gt;</w:t>
+      </w:r>
+    </w:p>
+    <w:p>
+      <w:pPr>
+        <w:numPr>
+          <w:ilvl w:val="0"/>
+          <w:numId w:val="0"/>
+        </w:numPr>
+        <w:rPr>
+          <w:rFonts w:hint="default" w:ascii="Trebuchet MS" w:hAnsi="Trebuchet MS" w:eastAsia="SimSun" w:cs="Trebuchet MS"/>
+          <w:i w:val="0"/>
+          <w:iCs w:val="0"/>
+          <w:caps w:val="0"/>
+          <w:color w:val="303030"/>
+          <w:spacing w:val="0"/>
+          <w:sz w:val="21"/>
+          <w:szCs w:val="21"/>
+          <w:shd w:val="clear" w:fill="FFFFFF"/>
+          <w:lang w:val="ru-RU"/>
+        </w:rPr>
+      </w:pPr>
+      <w:r>
+        <w:rPr>
+          <w:rFonts w:hint="default" w:ascii="Trebuchet MS" w:hAnsi="Trebuchet MS" w:eastAsia="SimSun" w:cs="Trebuchet MS"/>
+          <w:i w:val="0"/>
+          <w:iCs w:val="0"/>
+          <w:color w:val="303030"/>
+          <w:spacing w:val="0"/>
+          <w:sz w:val="21"/>
+          <w:szCs w:val="21"/>
+          <w:shd w:val="clear" w:fill="FFFFFF"/>
+          <w:lang w:val="en-US"/>
+        </w:rPr>
+        <w:t>P</w:t>
+      </w:r>
+      <w:r>
+        <w:rPr>
+          <w:rFonts w:hint="default" w:ascii="Trebuchet MS" w:hAnsi="Trebuchet MS" w:eastAsia="SimSun" w:cs="Trebuchet MS"/>
+          <w:i w:val="0"/>
+          <w:iCs w:val="0"/>
+          <w:caps w:val="0"/>
+          <w:color w:val="303030"/>
+          <w:spacing w:val="0"/>
+          <w:sz w:val="21"/>
+          <w:szCs w:val="21"/>
+          <w:shd w:val="clear" w:fill="FFFFFF"/>
+          <w:lang w:val="en-US"/>
+        </w:rPr>
+        <w:t xml:space="preserve"> - </w:t>
+      </w:r>
+      <w:r>
+        <w:rPr>
+          <w:rFonts w:hint="default" w:ascii="Trebuchet MS" w:hAnsi="Trebuchet MS" w:eastAsia="SimSun" w:cs="Trebuchet MS"/>
+          <w:i w:val="0"/>
+          <w:iCs w:val="0"/>
+          <w:caps w:val="0"/>
+          <w:color w:val="303030"/>
+          <w:spacing w:val="0"/>
+          <w:sz w:val="21"/>
+          <w:szCs w:val="21"/>
+          <w:shd w:val="clear" w:fill="FFFFFF"/>
+          <w:lang w:val="ru-RU"/>
+        </w:rPr>
+        <w:t>параграфы в тексте</w:t>
+      </w:r>
+    </w:p>
+    <w:p>
+      <w:pPr>
+        <w:numPr>
+          <w:ilvl w:val="0"/>
+          <w:numId w:val="0"/>
+        </w:numPr>
+        <w:rPr>
+          <w:rFonts w:hint="default" w:ascii="Trebuchet MS" w:hAnsi="Trebuchet MS" w:eastAsia="SimSun" w:cs="Trebuchet MS"/>
+          <w:i w:val="0"/>
+          <w:iCs w:val="0"/>
+          <w:caps w:val="0"/>
+          <w:color w:val="303030"/>
+          <w:spacing w:val="0"/>
+          <w:sz w:val="21"/>
+          <w:szCs w:val="21"/>
+          <w:shd w:val="clear" w:fill="FFFFFF"/>
+          <w:lang w:val="en-US"/>
+        </w:rPr>
+      </w:pPr>
+      <w:r>
+        <w:rPr>
+          <w:rFonts w:hint="default" w:ascii="Trebuchet MS" w:hAnsi="Trebuchet MS" w:eastAsia="SimSun" w:cs="Trebuchet MS"/>
+          <w:i w:val="0"/>
+          <w:iCs w:val="0"/>
+          <w:color w:val="303030"/>
+          <w:spacing w:val="0"/>
+          <w:sz w:val="21"/>
+          <w:szCs w:val="21"/>
+          <w:shd w:val="clear" w:fill="FFFFFF"/>
+          <w:lang w:val="en-US"/>
+        </w:rPr>
+        <w:t>&lt;S</w:t>
+      </w:r>
+      <w:r>
+        <w:rPr>
+          <w:rFonts w:hint="default" w:ascii="Trebuchet MS" w:hAnsi="Trebuchet MS" w:eastAsia="SimSun" w:cs="Trebuchet MS"/>
+          <w:i w:val="0"/>
+          <w:iCs w:val="0"/>
+          <w:caps w:val="0"/>
+          <w:color w:val="303030"/>
+          <w:spacing w:val="0"/>
+          <w:sz w:val="21"/>
+          <w:szCs w:val="21"/>
+          <w:shd w:val="clear" w:fill="FFFFFF"/>
+          <w:lang w:val="en-US"/>
+        </w:rPr>
+        <w:t>trong&gt;&lt;/strong&gt;</w:t>
+      </w:r>
+    </w:p>
+    <w:p>
+      <w:pPr>
+        <w:numPr>
+          <w:ilvl w:val="0"/>
+          <w:numId w:val="0"/>
+        </w:numPr>
+        <w:rPr>
+          <w:rFonts w:hint="default" w:ascii="Trebuchet MS" w:hAnsi="Trebuchet MS" w:eastAsia="SimSun" w:cs="Trebuchet MS"/>
+          <w:i w:val="0"/>
+          <w:iCs w:val="0"/>
+          <w:caps w:val="0"/>
+          <w:color w:val="303030"/>
+          <w:spacing w:val="0"/>
+          <w:sz w:val="21"/>
+          <w:szCs w:val="21"/>
+          <w:shd w:val="clear" w:fill="FFFFFF"/>
+          <w:lang w:val="en-US"/>
+        </w:rPr>
+      </w:pPr>
+      <w:r>
+        <w:rPr>
+          <w:rFonts w:hint="default" w:ascii="Trebuchet MS" w:hAnsi="Trebuchet MS" w:eastAsia="SimSun" w:cs="Trebuchet MS"/>
+          <w:i w:val="0"/>
+          <w:iCs w:val="0"/>
+          <w:caps w:val="0"/>
+          <w:color w:val="303030"/>
+          <w:spacing w:val="0"/>
+          <w:sz w:val="21"/>
+          <w:szCs w:val="21"/>
+          <w:shd w:val="clear" w:fill="FFFFFF"/>
+          <w:lang w:val="en-US"/>
+        </w:rPr>
+        <w:t>&lt;em&gt;&lt;/em&gt;</w:t>
+      </w:r>
+    </w:p>
+    <w:p>
+      <w:pPr>
+        <w:numPr>
+          <w:ilvl w:val="0"/>
+          <w:numId w:val="0"/>
+        </w:numPr>
+        <w:rPr>
+          <w:rFonts w:hint="default" w:ascii="Trebuchet MS" w:hAnsi="Trebuchet MS" w:eastAsia="SimSun" w:cs="Trebuchet MS"/>
+          <w:i w:val="0"/>
+          <w:iCs w:val="0"/>
+          <w:caps w:val="0"/>
+          <w:color w:val="303030"/>
+          <w:spacing w:val="0"/>
+          <w:sz w:val="21"/>
+          <w:szCs w:val="21"/>
+          <w:shd w:val="clear" w:fill="FFFFFF"/>
+          <w:lang w:val="en-US"/>
+        </w:rPr>
+      </w:pPr>
+      <w:r>
+        <w:rPr>
+          <w:rFonts w:hint="default" w:ascii="Trebuchet MS" w:hAnsi="Trebuchet MS" w:eastAsia="SimSun" w:cs="Trebuchet MS"/>
+          <w:i w:val="0"/>
+          <w:iCs w:val="0"/>
+          <w:caps w:val="0"/>
+          <w:color w:val="303030"/>
+          <w:spacing w:val="0"/>
+          <w:sz w:val="21"/>
+          <w:szCs w:val="21"/>
+          <w:shd w:val="clear" w:fill="FFFFFF"/>
+          <w:lang w:val="en-US"/>
+        </w:rPr>
+        <w:t>&lt;small&gt;&lt;/small&gt;</w:t>
+      </w:r>
+    </w:p>
+    <w:p>
+      <w:pPr>
+        <w:numPr>
+          <w:ilvl w:val="0"/>
+          <w:numId w:val="0"/>
+        </w:numPr>
+        <w:rPr>
+          <w:rFonts w:hint="default" w:ascii="Trebuchet MS" w:hAnsi="Trebuchet MS" w:eastAsia="SimSun" w:cs="Trebuchet MS"/>
+          <w:i w:val="0"/>
+          <w:iCs w:val="0"/>
+          <w:caps w:val="0"/>
+          <w:color w:val="303030"/>
+          <w:spacing w:val="0"/>
+          <w:sz w:val="21"/>
+          <w:szCs w:val="21"/>
+          <w:shd w:val="clear" w:fill="FFFFFF"/>
+          <w:lang w:val="en-US"/>
+        </w:rPr>
+      </w:pPr>
+      <w:r>
+        <w:rPr>
+          <w:rFonts w:hint="default" w:ascii="Trebuchet MS" w:hAnsi="Trebuchet MS" w:eastAsia="SimSun" w:cs="Trebuchet MS"/>
+          <w:i w:val="0"/>
+          <w:iCs w:val="0"/>
+          <w:caps w:val="0"/>
+          <w:color w:val="303030"/>
+          <w:spacing w:val="0"/>
+          <w:sz w:val="21"/>
+          <w:szCs w:val="21"/>
+          <w:shd w:val="clear" w:fill="FFFFFF"/>
+          <w:lang w:val="en-US"/>
+        </w:rPr>
+        <w:t>&lt;mark&gt;&lt;/mark&gt;</w:t>
+      </w:r>
+    </w:p>
+    <w:p>
+      <w:pPr>
+        <w:numPr>
+          <w:ilvl w:val="0"/>
+          <w:numId w:val="0"/>
+        </w:numPr>
+        <w:rPr>
+          <w:rFonts w:hint="default" w:ascii="Trebuchet MS" w:hAnsi="Trebuchet MS" w:eastAsia="SimSun" w:cs="Trebuchet MS"/>
+          <w:i w:val="0"/>
+          <w:iCs w:val="0"/>
+          <w:caps w:val="0"/>
+          <w:color w:val="303030"/>
+          <w:spacing w:val="0"/>
+          <w:sz w:val="21"/>
+          <w:szCs w:val="21"/>
+          <w:shd w:val="clear" w:fill="FFFFFF"/>
+          <w:lang w:val="en-US"/>
+        </w:rPr>
+      </w:pPr>
+      <w:r>
+        <w:rPr>
+          <w:rFonts w:hint="default" w:ascii="Trebuchet MS" w:hAnsi="Trebuchet MS" w:eastAsia="SimSun" w:cs="Trebuchet MS"/>
+          <w:i w:val="0"/>
+          <w:iCs w:val="0"/>
+          <w:caps w:val="0"/>
+          <w:color w:val="303030"/>
+          <w:spacing w:val="0"/>
+          <w:sz w:val="21"/>
+          <w:szCs w:val="21"/>
+          <w:shd w:val="clear" w:fill="FFFFFF"/>
+          <w:lang w:val="en-US"/>
+        </w:rPr>
+        <w:t>&lt;span&gt;&lt;/span&gt;</w:t>
+      </w:r>
+    </w:p>
+    <w:p>
+      <w:pPr>
+        <w:numPr>
+          <w:ilvl w:val="0"/>
+          <w:numId w:val="0"/>
+        </w:numPr>
+        <w:rPr>
+          <w:rFonts w:hint="default" w:ascii="Trebuchet MS" w:hAnsi="Trebuchet MS" w:eastAsia="SimSun" w:cs="Trebuchet MS"/>
+          <w:i w:val="0"/>
+          <w:iCs w:val="0"/>
+          <w:caps w:val="0"/>
+          <w:color w:val="303030"/>
+          <w:spacing w:val="0"/>
+          <w:sz w:val="21"/>
+          <w:szCs w:val="21"/>
+          <w:shd w:val="clear" w:fill="FFFFFF"/>
+          <w:lang w:val="ru-RU"/>
+        </w:rPr>
+      </w:pPr>
+      <w:r>
+        <w:rPr>
+          <w:rFonts w:hint="default" w:ascii="Trebuchet MS" w:hAnsi="Trebuchet MS" w:eastAsia="SimSun" w:cs="Trebuchet MS"/>
+          <w:i w:val="0"/>
+          <w:iCs w:val="0"/>
+          <w:color w:val="303030"/>
+          <w:spacing w:val="0"/>
+          <w:sz w:val="21"/>
+          <w:szCs w:val="21"/>
+          <w:shd w:val="clear" w:fill="FFFFFF"/>
+          <w:lang w:val="en-US"/>
+        </w:rPr>
+        <w:t>H</w:t>
+      </w:r>
+      <w:r>
+        <w:rPr>
+          <w:rFonts w:hint="default" w:ascii="Trebuchet MS" w:hAnsi="Trebuchet MS" w:eastAsia="SimSun" w:cs="Trebuchet MS"/>
+          <w:i w:val="0"/>
+          <w:iCs w:val="0"/>
+          <w:caps w:val="0"/>
+          <w:color w:val="303030"/>
+          <w:spacing w:val="0"/>
+          <w:sz w:val="21"/>
+          <w:szCs w:val="21"/>
+          <w:shd w:val="clear" w:fill="FFFFFF"/>
+          <w:lang w:val="en-US"/>
+        </w:rPr>
+        <w:t xml:space="preserve">1-H6 - </w:t>
+      </w:r>
+      <w:r>
+        <w:rPr>
+          <w:rFonts w:ascii="Trebuchet MS" w:hAnsi="Trebuchet MS" w:eastAsia="SimSun" w:cs="Trebuchet MS"/>
+          <w:i w:val="0"/>
+          <w:iCs w:val="0"/>
+          <w:caps w:val="0"/>
+          <w:color w:val="303030"/>
+          <w:spacing w:val="0"/>
+          <w:sz w:val="21"/>
+          <w:szCs w:val="21"/>
+          <w:shd w:val="clear" w:fill="FFFFFF"/>
+        </w:rPr>
+        <w:t>Создают заголовки шести уровней для связанных с ними разделов</w:t>
+      </w:r>
+      <w:r>
+        <w:rPr>
+          <w:rFonts w:hint="default" w:ascii="Trebuchet MS" w:hAnsi="Trebuchet MS" w:eastAsia="SimSun" w:cs="Trebuchet MS"/>
+          <w:i w:val="0"/>
+          <w:iCs w:val="0"/>
+          <w:caps w:val="0"/>
+          <w:color w:val="303030"/>
+          <w:spacing w:val="0"/>
+          <w:sz w:val="21"/>
+          <w:szCs w:val="21"/>
+          <w:shd w:val="clear" w:fill="FFFFFF"/>
+          <w:lang w:val="ru-RU"/>
+        </w:rPr>
+        <w:t>.</w:t>
+      </w:r>
+    </w:p>
+    <w:p>
+      <w:pPr>
+        <w:numPr>
+          <w:ilvl w:val="0"/>
+          <w:numId w:val="0"/>
+        </w:numPr>
+        <w:rPr>
+          <w:rFonts w:hint="default" w:ascii="Trebuchet MS" w:hAnsi="Trebuchet MS" w:eastAsia="SimSun" w:cs="Trebuchet MS"/>
+          <w:i w:val="0"/>
+          <w:iCs w:val="0"/>
+          <w:caps w:val="0"/>
+          <w:color w:val="303030"/>
+          <w:spacing w:val="0"/>
+          <w:sz w:val="21"/>
+          <w:szCs w:val="21"/>
+          <w:shd w:val="clear" w:fill="FFFFFF"/>
+          <w:lang w:val="ru-RU"/>
+        </w:rPr>
+      </w:pPr>
+      <w:r>
+        <w:rPr>
+          <w:rFonts w:hint="default" w:ascii="Trebuchet MS" w:hAnsi="Trebuchet MS" w:eastAsia="SimSun" w:cs="Trebuchet MS"/>
+          <w:i w:val="0"/>
+          <w:iCs w:val="0"/>
+          <w:caps w:val="0"/>
+          <w:color w:val="303030"/>
+          <w:spacing w:val="0"/>
+          <w:sz w:val="21"/>
+          <w:szCs w:val="21"/>
+          <w:shd w:val="clear" w:fill="FFFFFF"/>
+          <w:lang w:val="en-US"/>
+        </w:rPr>
+        <w:t xml:space="preserve">H1 - </w:t>
+      </w:r>
+      <w:r>
+        <w:rPr>
+          <w:rFonts w:hint="default" w:ascii="Trebuchet MS" w:hAnsi="Trebuchet MS" w:eastAsia="SimSun" w:cs="Trebuchet MS"/>
+          <w:i w:val="0"/>
+          <w:iCs w:val="0"/>
+          <w:caps w:val="0"/>
+          <w:color w:val="303030"/>
+          <w:spacing w:val="0"/>
+          <w:sz w:val="21"/>
+          <w:szCs w:val="21"/>
+          <w:shd w:val="clear" w:fill="FFFFFF"/>
+          <w:lang w:val="ru-RU"/>
+        </w:rPr>
+        <w:t>должен быть 1 на странице</w:t>
+      </w:r>
+    </w:p>
+    <w:p>
+      <w:pPr>
+        <w:numPr>
+          <w:ilvl w:val="0"/>
+          <w:numId w:val="0"/>
+        </w:numPr>
+        <w:rPr>
+          <w:rFonts w:hint="default" w:ascii="Trebuchet MS" w:hAnsi="Trebuchet MS" w:eastAsia="SimSun" w:cs="Trebuchet MS"/>
+          <w:i w:val="0"/>
+          <w:iCs w:val="0"/>
+          <w:caps w:val="0"/>
+          <w:color w:val="303030"/>
+          <w:spacing w:val="0"/>
+          <w:sz w:val="21"/>
+          <w:szCs w:val="21"/>
+          <w:shd w:val="clear" w:fill="FFFFFF"/>
+          <w:lang w:val="ru-RU"/>
+        </w:rPr>
+      </w:pPr>
+    </w:p>
+    <w:p>
+      <w:pPr>
+        <w:numPr>
+          <w:ilvl w:val="0"/>
+          <w:numId w:val="0"/>
+        </w:numPr>
+        <w:rPr>
+          <w:rFonts w:ascii="Trebuchet MS" w:hAnsi="Trebuchet MS" w:eastAsia="SimSun" w:cs="Trebuchet MS"/>
+          <w:i w:val="0"/>
+          <w:iCs w:val="0"/>
+          <w:caps w:val="0"/>
+          <w:color w:val="303030"/>
+          <w:spacing w:val="0"/>
+          <w:sz w:val="21"/>
+          <w:szCs w:val="21"/>
+          <w:shd w:val="clear" w:fill="FFFFFF"/>
+        </w:rPr>
+      </w:pPr>
+      <w:r>
+        <w:rPr>
+          <w:rFonts w:hint="default" w:ascii="Trebuchet MS" w:hAnsi="Trebuchet MS" w:eastAsia="SimSun" w:cs="Trebuchet MS"/>
+          <w:i w:val="0"/>
+          <w:iCs w:val="0"/>
+          <w:caps w:val="0"/>
+          <w:color w:val="303030"/>
+          <w:spacing w:val="0"/>
+          <w:sz w:val="21"/>
+          <w:szCs w:val="21"/>
+          <w:shd w:val="clear" w:fill="FFFFFF"/>
+          <w:lang w:val="en-US"/>
+        </w:rPr>
+        <w:t xml:space="preserve">&lt;a&gt; </w:t>
+      </w:r>
+      <w:r>
+        <w:rPr>
+          <w:rFonts w:ascii="Trebuchet MS" w:hAnsi="Trebuchet MS" w:eastAsia="SimSun" w:cs="Trebuchet MS"/>
+          <w:i w:val="0"/>
+          <w:iCs w:val="0"/>
+          <w:caps w:val="0"/>
+          <w:color w:val="303030"/>
+          <w:spacing w:val="0"/>
+          <w:sz w:val="21"/>
+          <w:szCs w:val="21"/>
+          <w:shd w:val="clear" w:fill="FFFFFF"/>
+        </w:rPr>
+        <w:t>Создаёт гипертекстовые ссылки.</w:t>
+      </w:r>
+    </w:p>
+    <w:p>
+      <w:pPr>
+        <w:numPr>
+          <w:ilvl w:val="0"/>
+          <w:numId w:val="0"/>
+        </w:numPr>
+        <w:rPr>
+          <w:rFonts w:hint="default" w:ascii="Trebuchet MS" w:hAnsi="Trebuchet MS" w:eastAsia="SimSun" w:cs="Trebuchet MS"/>
+          <w:i w:val="0"/>
+          <w:iCs w:val="0"/>
+          <w:caps w:val="0"/>
+          <w:color w:val="303030"/>
+          <w:spacing w:val="0"/>
+          <w:sz w:val="21"/>
+          <w:szCs w:val="21"/>
+          <w:shd w:val="clear" w:fill="FFFFFF"/>
+          <w:lang w:val="en-US"/>
+        </w:rPr>
+      </w:pPr>
+      <w:r>
+        <w:rPr>
+          <w:rFonts w:hint="default" w:ascii="Trebuchet MS" w:hAnsi="Trebuchet MS" w:eastAsia="SimSun" w:cs="Trebuchet MS"/>
+          <w:i w:val="0"/>
+          <w:iCs w:val="0"/>
+          <w:caps w:val="0"/>
+          <w:color w:val="303030"/>
+          <w:spacing w:val="0"/>
+          <w:sz w:val="21"/>
+          <w:szCs w:val="21"/>
+          <w:shd w:val="clear" w:fill="FFFFFF"/>
+          <w:lang w:val="en-US"/>
+        </w:rPr>
+        <w:drawing>
+          <wp:inline distT="0" distB="0" distL="114300" distR="114300">
+            <wp:extent cx="3019425" cy="4391025"/>
+            <wp:effectExtent l="0" t="0" r="9525" b="9525"/>
+            <wp:docPr id="3" name="Изображение 3" descr="{C4F4F6A8-3CA1-4729-A403-A85F35C62362}"/>
+            <wp:cNvGraphicFramePr>
+              <a:graphicFrameLocks xmlns:a="http://schemas.openxmlformats.org/drawingml/2006/main" noChangeAspect="1"/>
+            </wp:cNvGraphicFramePr>
+            <a:graphic xmlns:a="http://schemas.openxmlformats.org/drawingml/2006/main">
+              <a:graphicData uri="http://schemas.openxmlformats.org/drawingml/2006/picture">
+                <pic:pic xmlns:pic="http://schemas.openxmlformats.org/drawingml/2006/picture">
+                  <pic:nvPicPr>
+                    <pic:cNvPr id="3" name="Изображение 3" descr="{C4F4F6A8-3CA1-4729-A403-A85F35C62362}"/>
+                    <pic:cNvPicPr>
+                      <a:picLocks noChangeAspect="1"/>
+                    </pic:cNvPicPr>
+                  </pic:nvPicPr>
+                  <pic:blipFill>
+                    <a:blip r:embed="rId5"/>
+                    <a:stretch>
+                      <a:fillRect/>
+                    </a:stretch>
+                  </pic:blipFill>
+                  <pic:spPr>
+                    <a:xfrm>
+                      <a:off x="0" y="0"/>
+                      <a:ext cx="3019425" cy="4391025"/>
+                    </a:xfrm>
+                    <a:prstGeom prst="rect">
+                      <a:avLst/>
+                    </a:prstGeom>
+                  </pic:spPr>
+                </pic:pic>
+              </a:graphicData>
+            </a:graphic>
+          </wp:inline>
+        </w:drawing>
+      </w:r>
+      <w:r>
+        <w:rPr>
+          <w:rFonts w:hint="default" w:ascii="Trebuchet MS" w:hAnsi="Trebuchet MS" w:eastAsia="SimSun" w:cs="Trebuchet MS"/>
+          <w:i w:val="0"/>
+          <w:iCs w:val="0"/>
+          <w:caps w:val="0"/>
+          <w:color w:val="303030"/>
+          <w:spacing w:val="0"/>
+          <w:sz w:val="21"/>
+          <w:szCs w:val="21"/>
+          <w:shd w:val="clear" w:fill="FFFFFF"/>
+          <w:lang w:val="en-US"/>
+        </w:rPr>
+        <w:drawing>
+          <wp:inline distT="0" distB="0" distL="114300" distR="114300">
+            <wp:extent cx="5479415" cy="2896870"/>
+            <wp:effectExtent l="0" t="0" r="6985" b="17780"/>
+            <wp:docPr id="2" name="Изображение 2" descr="{C841BFB0-07A2-47AD-AA4E-50F3D68548F1}"/>
+            <wp:cNvGraphicFramePr>
+              <a:graphicFrameLocks xmlns:a="http://schemas.openxmlformats.org/drawingml/2006/main" noChangeAspect="1"/>
+            </wp:cNvGraphicFramePr>
+            <a:graphic xmlns:a="http://schemas.openxmlformats.org/drawingml/2006/main">
+              <a:graphicData uri="http://schemas.openxmlformats.org/drawingml/2006/picture">
+                <pic:pic xmlns:pic="http://schemas.openxmlformats.org/drawingml/2006/picture">
+                  <pic:nvPicPr>
+                    <pic:cNvPr id="2" name="Изображение 2" descr="{C841BFB0-07A2-47AD-AA4E-50F3D68548F1}"/>
+                    <pic:cNvPicPr>
+                      <a:picLocks noChangeAspect="1"/>
+                    </pic:cNvPicPr>
+                  </pic:nvPicPr>
+                  <pic:blipFill>
+                    <a:blip r:embed="rId6"/>
+                    <a:stretch>
+                      <a:fillRect/>
+                    </a:stretch>
+                  </pic:blipFill>
+                  <pic:spPr>
+                    <a:xfrm>
+                      <a:off x="0" y="0"/>
+                      <a:ext cx="5479415" cy="2896870"/>
+                    </a:xfrm>
+                    <a:prstGeom prst="rect">
+                      <a:avLst/>
+                    </a:prstGeom>
+                  </pic:spPr>
+                </pic:pic>
+              </a:graphicData>
+            </a:graphic>
+          </wp:inline>
+        </w:drawing>
+      </w:r>
+    </w:p>
+    <w:p>
+      <w:pPr>
+        <w:numPr>
+          <w:ilvl w:val="0"/>
+          <w:numId w:val="0"/>
+        </w:numPr>
+        <w:rPr>
+          <w:rFonts w:hint="default" w:ascii="Trebuchet MS" w:hAnsi="Trebuchet MS" w:eastAsia="SimSun" w:cs="Trebuchet MS"/>
+          <w:i w:val="0"/>
+          <w:iCs w:val="0"/>
+          <w:caps w:val="0"/>
+          <w:color w:val="303030"/>
+          <w:spacing w:val="0"/>
+          <w:sz w:val="21"/>
+          <w:szCs w:val="21"/>
+          <w:shd w:val="clear" w:fill="FFFFFF"/>
+          <w:lang w:val="ru-RU"/>
+        </w:rPr>
+      </w:pPr>
+      <w:r>
+        <w:rPr>
+          <w:rFonts w:hint="default" w:ascii="Trebuchet MS" w:hAnsi="Trebuchet MS" w:eastAsia="SimSun" w:cs="Trebuchet MS"/>
+          <w:i w:val="0"/>
+          <w:iCs w:val="0"/>
+          <w:color w:val="303030"/>
+          <w:spacing w:val="0"/>
+          <w:sz w:val="21"/>
+          <w:szCs w:val="21"/>
+          <w:shd w:val="clear" w:fill="FFFFFF"/>
+          <w:lang w:val="ru-RU"/>
+        </w:rPr>
+        <w:t>Т</w:t>
+      </w:r>
+      <w:r>
+        <w:rPr>
+          <w:rFonts w:hint="default" w:ascii="Trebuchet MS" w:hAnsi="Trebuchet MS" w:eastAsia="SimSun" w:cs="Trebuchet MS"/>
+          <w:i w:val="0"/>
+          <w:iCs w:val="0"/>
+          <w:caps w:val="0"/>
+          <w:color w:val="303030"/>
+          <w:spacing w:val="0"/>
+          <w:sz w:val="21"/>
+          <w:szCs w:val="21"/>
+          <w:shd w:val="clear" w:fill="FFFFFF"/>
+          <w:lang w:val="ru-RU"/>
+        </w:rPr>
+        <w:t>аблицы необходимы для вывода базы данных (с базы данных)</w:t>
+      </w:r>
+    </w:p>
+    <w:p>
+      <w:pPr>
+        <w:numPr>
+          <w:ilvl w:val="0"/>
+          <w:numId w:val="0"/>
+        </w:numPr>
+        <w:rPr>
+          <w:rFonts w:hint="default" w:ascii="Trebuchet MS" w:hAnsi="Trebuchet MS" w:eastAsia="SimSun" w:cs="Trebuchet MS"/>
+          <w:i w:val="0"/>
+          <w:iCs w:val="0"/>
+          <w:caps w:val="0"/>
+          <w:color w:val="303030"/>
+          <w:spacing w:val="0"/>
+          <w:sz w:val="21"/>
+          <w:szCs w:val="21"/>
+          <w:shd w:val="clear" w:fill="FFFFFF"/>
+          <w:lang w:val="ru-RU"/>
+        </w:rPr>
+      </w:pPr>
+    </w:p>
+    <w:p>
+      <w:pPr>
+        <w:numPr>
+          <w:ilvl w:val="0"/>
+          <w:numId w:val="0"/>
+        </w:numPr>
+        <w:rPr>
+          <w:rFonts w:hint="default" w:ascii="Trebuchet MS" w:hAnsi="Trebuchet MS" w:eastAsia="SimSun" w:cs="Trebuchet MS"/>
+          <w:i w:val="0"/>
+          <w:iCs w:val="0"/>
+          <w:caps w:val="0"/>
+          <w:color w:val="303030"/>
+          <w:spacing w:val="0"/>
+          <w:sz w:val="21"/>
+          <w:szCs w:val="21"/>
+          <w:shd w:val="clear" w:fill="FFFFFF"/>
+          <w:lang w:val="ru-RU"/>
+        </w:rPr>
+      </w:pPr>
+      <w:r>
+        <w:rPr>
+          <w:rFonts w:hint="default" w:ascii="Trebuchet MS" w:hAnsi="Trebuchet MS" w:eastAsia="SimSun" w:cs="Trebuchet MS"/>
+          <w:i w:val="0"/>
+          <w:iCs w:val="0"/>
+          <w:color w:val="303030"/>
+          <w:spacing w:val="0"/>
+          <w:sz w:val="21"/>
+          <w:szCs w:val="21"/>
+          <w:shd w:val="clear" w:fill="FFFFFF"/>
+          <w:lang w:val="ru-RU"/>
+        </w:rPr>
+        <w:t>Ф</w:t>
+      </w:r>
+      <w:r>
+        <w:rPr>
+          <w:rFonts w:hint="default" w:ascii="Trebuchet MS" w:hAnsi="Trebuchet MS" w:eastAsia="SimSun" w:cs="Trebuchet MS"/>
+          <w:i w:val="0"/>
+          <w:iCs w:val="0"/>
+          <w:caps w:val="0"/>
+          <w:color w:val="303030"/>
+          <w:spacing w:val="0"/>
+          <w:sz w:val="21"/>
+          <w:szCs w:val="21"/>
+          <w:shd w:val="clear" w:fill="FFFFFF"/>
+          <w:lang w:val="ru-RU"/>
+        </w:rPr>
+        <w:t>ормы</w:t>
+      </w:r>
+    </w:p>
+    <w:p>
+      <w:pPr>
+        <w:numPr>
+          <w:ilvl w:val="0"/>
+          <w:numId w:val="0"/>
+        </w:numPr>
+        <w:rPr>
+          <w:rFonts w:hint="default" w:ascii="Trebuchet MS" w:hAnsi="Trebuchet MS" w:eastAsia="SimSun" w:cs="Trebuchet MS"/>
+          <w:i w:val="0"/>
+          <w:iCs w:val="0"/>
+          <w:caps w:val="0"/>
+          <w:color w:val="303030"/>
+          <w:spacing w:val="0"/>
+          <w:sz w:val="21"/>
+          <w:szCs w:val="21"/>
+          <w:shd w:val="clear" w:fill="FFFFFF"/>
+          <w:lang w:val="en-US"/>
+        </w:rPr>
+      </w:pPr>
+      <w:r>
+        <w:rPr>
+          <w:rFonts w:hint="default" w:ascii="Trebuchet MS" w:hAnsi="Trebuchet MS" w:eastAsia="SimSun" w:cs="Trebuchet MS"/>
+          <w:i w:val="0"/>
+          <w:iCs w:val="0"/>
+          <w:caps w:val="0"/>
+          <w:color w:val="303030"/>
+          <w:spacing w:val="0"/>
+          <w:sz w:val="21"/>
+          <w:szCs w:val="21"/>
+          <w:shd w:val="clear" w:fill="FFFFFF"/>
+          <w:lang w:val="en-US"/>
+        </w:rPr>
+        <w:t>&lt;form&gt;</w:t>
+      </w:r>
+    </w:p>
+    <w:p>
+      <w:pPr>
+        <w:numPr>
+          <w:ilvl w:val="0"/>
+          <w:numId w:val="0"/>
+        </w:numPr>
+        <w:rPr>
+          <w:rFonts w:hint="default" w:ascii="Trebuchet MS" w:hAnsi="Trebuchet MS" w:eastAsia="SimSun" w:cs="Trebuchet MS"/>
+          <w:i w:val="0"/>
+          <w:iCs w:val="0"/>
+          <w:caps w:val="0"/>
+          <w:color w:val="303030"/>
+          <w:spacing w:val="0"/>
+          <w:sz w:val="21"/>
+          <w:szCs w:val="21"/>
+          <w:shd w:val="clear" w:fill="FFFFFF"/>
+          <w:lang w:val="ru-RU"/>
+        </w:rPr>
+      </w:pPr>
+      <w:r>
+        <w:rPr>
+          <w:rFonts w:hint="default" w:ascii="Trebuchet MS" w:hAnsi="Trebuchet MS" w:eastAsia="SimSun" w:cs="Trebuchet MS"/>
+          <w:i w:val="0"/>
+          <w:iCs w:val="0"/>
+          <w:caps w:val="0"/>
+          <w:color w:val="303030"/>
+          <w:spacing w:val="0"/>
+          <w:sz w:val="21"/>
+          <w:szCs w:val="21"/>
+          <w:shd w:val="clear" w:fill="FFFFFF"/>
+          <w:lang w:val="ru-RU"/>
+        </w:rPr>
+        <w:t xml:space="preserve">Форма для сбора и отправки на сервак инфы от пользователей. </w:t>
+      </w:r>
+      <w:r>
+        <w:rPr>
+          <w:rFonts w:hint="default" w:ascii="Trebuchet MS" w:hAnsi="Trebuchet MS" w:eastAsia="SimSun" w:cs="Trebuchet MS"/>
+          <w:i w:val="0"/>
+          <w:iCs w:val="0"/>
+          <w:color w:val="303030"/>
+          <w:spacing w:val="0"/>
+          <w:sz w:val="21"/>
+          <w:szCs w:val="21"/>
+          <w:shd w:val="clear" w:fill="FFFFFF"/>
+          <w:lang w:val="ru-RU"/>
+        </w:rPr>
+        <w:t>Н</w:t>
+      </w:r>
+      <w:r>
+        <w:rPr>
+          <w:rFonts w:hint="default" w:ascii="Trebuchet MS" w:hAnsi="Trebuchet MS" w:eastAsia="SimSun" w:cs="Trebuchet MS"/>
+          <w:i w:val="0"/>
+          <w:iCs w:val="0"/>
+          <w:caps w:val="0"/>
+          <w:color w:val="303030"/>
+          <w:spacing w:val="0"/>
+          <w:sz w:val="21"/>
+          <w:szCs w:val="21"/>
+          <w:shd w:val="clear" w:fill="FFFFFF"/>
+          <w:lang w:val="ru-RU"/>
+        </w:rPr>
+        <w:t>е работает без</w:t>
+      </w:r>
+    </w:p>
+    <w:p>
+      <w:pPr>
+        <w:numPr>
+          <w:ilvl w:val="0"/>
+          <w:numId w:val="0"/>
+        </w:numPr>
+        <w:rPr>
+          <w:rFonts w:hint="default" w:ascii="Trebuchet MS" w:hAnsi="Trebuchet MS" w:eastAsia="SimSun" w:cs="Trebuchet MS"/>
+          <w:i w:val="0"/>
+          <w:iCs w:val="0"/>
+          <w:caps w:val="0"/>
+          <w:color w:val="303030"/>
+          <w:spacing w:val="0"/>
+          <w:sz w:val="21"/>
+          <w:szCs w:val="21"/>
+          <w:shd w:val="clear" w:fill="FFFFFF"/>
+          <w:lang w:val="en-US"/>
+        </w:rPr>
+      </w:pPr>
+      <w:r>
+        <w:rPr>
+          <w:rFonts w:hint="default" w:ascii="Trebuchet MS" w:hAnsi="Trebuchet MS" w:eastAsia="SimSun" w:cs="Trebuchet MS"/>
+          <w:i w:val="0"/>
+          <w:iCs w:val="0"/>
+          <w:caps w:val="0"/>
+          <w:color w:val="303030"/>
+          <w:spacing w:val="0"/>
+          <w:sz w:val="21"/>
+          <w:szCs w:val="21"/>
+          <w:shd w:val="clear" w:fill="FFFFFF"/>
+          <w:lang w:val="ru-RU"/>
+        </w:rPr>
+        <w:t xml:space="preserve"> атрибута </w:t>
+      </w:r>
+      <w:r>
+        <w:rPr>
+          <w:rFonts w:hint="default" w:ascii="Trebuchet MS" w:hAnsi="Trebuchet MS" w:eastAsia="SimSun" w:cs="Trebuchet MS"/>
+          <w:i w:val="0"/>
+          <w:iCs w:val="0"/>
+          <w:caps w:val="0"/>
+          <w:color w:val="303030"/>
+          <w:spacing w:val="0"/>
+          <w:sz w:val="21"/>
+          <w:szCs w:val="21"/>
+          <w:shd w:val="clear" w:fill="FFFFFF"/>
+          <w:lang w:val="en-US"/>
+        </w:rPr>
+        <w:t>&lt;action&gt;</w:t>
+      </w:r>
+    </w:p>
+    <w:p>
+      <w:pPr>
+        <w:numPr>
+          <w:ilvl w:val="0"/>
+          <w:numId w:val="0"/>
+        </w:numPr>
+        <w:rPr>
+          <w:rFonts w:hint="default" w:ascii="Trebuchet MS" w:hAnsi="Trebuchet MS" w:eastAsia="SimSun" w:cs="Trebuchet MS"/>
+          <w:i w:val="0"/>
+          <w:iCs w:val="0"/>
+          <w:caps w:val="0"/>
+          <w:color w:val="303030"/>
+          <w:spacing w:val="0"/>
+          <w:sz w:val="21"/>
+          <w:szCs w:val="21"/>
+          <w:shd w:val="clear" w:fill="FFFFFF"/>
+          <w:lang w:val="ru-RU"/>
+        </w:rPr>
+      </w:pPr>
+      <w:r>
+        <w:rPr>
+          <w:rFonts w:hint="default" w:ascii="Trebuchet MS" w:hAnsi="Trebuchet MS" w:eastAsia="SimSun" w:cs="Trebuchet MS"/>
+          <w:i w:val="0"/>
+          <w:iCs w:val="0"/>
+          <w:caps w:val="0"/>
+          <w:color w:val="303030"/>
+          <w:spacing w:val="0"/>
+          <w:sz w:val="21"/>
+          <w:szCs w:val="21"/>
+          <w:shd w:val="clear" w:fill="FFFFFF"/>
+          <w:lang w:val="ru-RU"/>
+        </w:rPr>
+        <w:drawing>
+          <wp:inline distT="0" distB="0" distL="114300" distR="114300">
+            <wp:extent cx="5484495" cy="984885"/>
+            <wp:effectExtent l="0" t="0" r="1905" b="5715"/>
+            <wp:docPr id="6" name="Изображение 6" descr="{83A7BB38-B2F0-4100-9BEF-5E4A5B83CBDD}"/>
+            <wp:cNvGraphicFramePr>
+              <a:graphicFrameLocks xmlns:a="http://schemas.openxmlformats.org/drawingml/2006/main" noChangeAspect="1"/>
+            </wp:cNvGraphicFramePr>
+            <a:graphic xmlns:a="http://schemas.openxmlformats.org/drawingml/2006/main">
+              <a:graphicData uri="http://schemas.openxmlformats.org/drawingml/2006/picture">
+                <pic:pic xmlns:pic="http://schemas.openxmlformats.org/drawingml/2006/picture">
+                  <pic:nvPicPr>
+                    <pic:cNvPr id="6" name="Изображение 6" descr="{83A7BB38-B2F0-4100-9BEF-5E4A5B83CBDD}"/>
+                    <pic:cNvPicPr>
+                      <a:picLocks noChangeAspect="1"/>
+                    </pic:cNvPicPr>
+                  </pic:nvPicPr>
+                  <pic:blipFill>
+                    <a:blip r:embed="rId7"/>
+                    <a:stretch>
+                      <a:fillRect/>
+                    </a:stretch>
+                  </pic:blipFill>
+                  <pic:spPr>
+                    <a:xfrm>
+                      <a:off x="0" y="0"/>
+                      <a:ext cx="5484495" cy="984885"/>
+                    </a:xfrm>
+                    <a:prstGeom prst="rect">
+                      <a:avLst/>
+                    </a:prstGeom>
+                  </pic:spPr>
+                </pic:pic>
+              </a:graphicData>
+            </a:graphic>
+          </wp:inline>
+        </w:drawing>
+      </w:r>
+    </w:p>
+    <w:p>
+      <w:pPr>
+        <w:numPr>
+          <w:ilvl w:val="0"/>
+          <w:numId w:val="0"/>
+        </w:numPr>
+        <w:rPr>
+          <w:rFonts w:hint="default" w:ascii="Trebuchet MS" w:hAnsi="Trebuchet MS" w:eastAsia="SimSun" w:cs="Trebuchet MS"/>
+          <w:i w:val="0"/>
+          <w:iCs w:val="0"/>
+          <w:caps w:val="0"/>
+          <w:color w:val="303030"/>
+          <w:spacing w:val="0"/>
+          <w:sz w:val="21"/>
+          <w:szCs w:val="21"/>
+          <w:shd w:val="clear" w:fill="FFFFFF"/>
+          <w:lang w:val="ru-RU"/>
+        </w:rPr>
+      </w:pPr>
+      <w:r>
+        <w:rPr>
+          <w:rFonts w:hint="default" w:ascii="Trebuchet MS" w:hAnsi="Trebuchet MS" w:eastAsia="SimSun" w:cs="Trebuchet MS"/>
+          <w:i w:val="0"/>
+          <w:iCs w:val="0"/>
+          <w:caps w:val="0"/>
+          <w:color w:val="303030"/>
+          <w:spacing w:val="0"/>
+          <w:sz w:val="21"/>
+          <w:szCs w:val="21"/>
+          <w:shd w:val="clear" w:fill="FFFFFF"/>
+          <w:lang w:val="ru-RU"/>
+        </w:rPr>
+        <w:t>Значение инпутов</w:t>
+      </w:r>
+      <w:r>
+        <w:rPr>
+          <w:rFonts w:hint="default" w:ascii="Trebuchet MS" w:hAnsi="Trebuchet MS" w:eastAsia="SimSun" w:cs="Trebuchet MS"/>
+          <w:i w:val="0"/>
+          <w:iCs w:val="0"/>
+          <w:caps w:val="0"/>
+          <w:color w:val="303030"/>
+          <w:spacing w:val="0"/>
+          <w:sz w:val="21"/>
+          <w:szCs w:val="21"/>
+          <w:shd w:val="clear" w:fill="FFFFFF"/>
+          <w:lang w:val="en-US"/>
+        </w:rPr>
+        <w:t>:</w:t>
+      </w:r>
+    </w:p>
+    <w:p>
+      <w:pPr>
+        <w:numPr>
+          <w:ilvl w:val="0"/>
+          <w:numId w:val="0"/>
+        </w:numPr>
+        <w:rPr>
+          <w:rFonts w:hint="default" w:ascii="Trebuchet MS" w:hAnsi="Trebuchet MS" w:eastAsia="SimSun" w:cs="Trebuchet MS"/>
+          <w:i w:val="0"/>
+          <w:iCs w:val="0"/>
+          <w:caps w:val="0"/>
+          <w:color w:val="303030"/>
+          <w:spacing w:val="0"/>
+          <w:sz w:val="21"/>
+          <w:szCs w:val="21"/>
+          <w:shd w:val="clear" w:fill="FFFFFF"/>
+          <w:lang w:val="ru-RU"/>
+        </w:rPr>
+      </w:pPr>
+      <w:r>
+        <w:rPr>
+          <w:rFonts w:hint="default" w:ascii="Trebuchet MS" w:hAnsi="Trebuchet MS" w:eastAsia="SimSun" w:cs="Trebuchet MS"/>
+          <w:i w:val="0"/>
+          <w:iCs w:val="0"/>
+          <w:caps w:val="0"/>
+          <w:color w:val="303030"/>
+          <w:spacing w:val="0"/>
+          <w:sz w:val="21"/>
+          <w:szCs w:val="21"/>
+          <w:shd w:val="clear" w:fill="FFFFFF"/>
+          <w:lang w:val="ru-RU"/>
+        </w:rPr>
+        <w:drawing>
+          <wp:inline distT="0" distB="0" distL="114300" distR="114300">
+            <wp:extent cx="1943100" cy="1685925"/>
+            <wp:effectExtent l="0" t="0" r="0" b="9525"/>
+            <wp:docPr id="4" name="Изображение 4" descr="{13B0DEF1-5591-4667-8C33-BF0B49609EBC}"/>
+            <wp:cNvGraphicFramePr>
+              <a:graphicFrameLocks xmlns:a="http://schemas.openxmlformats.org/drawingml/2006/main" noChangeAspect="1"/>
+            </wp:cNvGraphicFramePr>
+            <a:graphic xmlns:a="http://schemas.openxmlformats.org/drawingml/2006/main">
+              <a:graphicData uri="http://schemas.openxmlformats.org/drawingml/2006/picture">
+                <pic:pic xmlns:pic="http://schemas.openxmlformats.org/drawingml/2006/picture">
+                  <pic:nvPicPr>
+                    <pic:cNvPr id="4" name="Изображение 4" descr="{13B0DEF1-5591-4667-8C33-BF0B49609EBC}"/>
+                    <pic:cNvPicPr>
+                      <a:picLocks noChangeAspect="1"/>
+                    </pic:cNvPicPr>
+                  </pic:nvPicPr>
+                  <pic:blipFill>
+                    <a:blip r:embed="rId8"/>
+                    <a:stretch>
+                      <a:fillRect/>
+                    </a:stretch>
+                  </pic:blipFill>
+                  <pic:spPr>
+                    <a:xfrm>
+                      <a:off x="0" y="0"/>
+                      <a:ext cx="1943100" cy="1685925"/>
+                    </a:xfrm>
+                    <a:prstGeom prst="rect">
+                      <a:avLst/>
+                    </a:prstGeom>
+                  </pic:spPr>
+                </pic:pic>
+              </a:graphicData>
+            </a:graphic>
+          </wp:inline>
+        </w:drawing>
+      </w:r>
+    </w:p>
+    <w:p>
+      <w:pPr>
+        <w:numPr>
+          <w:ilvl w:val="0"/>
+          <w:numId w:val="0"/>
+        </w:numPr>
+        <w:rPr>
+          <w:rFonts w:hint="default" w:ascii="Trebuchet MS" w:hAnsi="Trebuchet MS" w:eastAsia="SimSun" w:cs="Trebuchet MS"/>
+          <w:i w:val="0"/>
+          <w:iCs w:val="0"/>
+          <w:caps w:val="0"/>
+          <w:color w:val="303030"/>
+          <w:spacing w:val="0"/>
+          <w:sz w:val="52"/>
+          <w:szCs w:val="52"/>
+          <w:shd w:val="clear" w:fill="FFFFFF"/>
+          <w:lang w:val="ru-RU"/>
+        </w:rPr>
+      </w:pPr>
+      <w:r>
+        <w:rPr>
+          <w:rFonts w:hint="default" w:ascii="Trebuchet MS" w:hAnsi="Trebuchet MS" w:eastAsia="SimSun" w:cs="Trebuchet MS"/>
+          <w:i w:val="0"/>
+          <w:iCs w:val="0"/>
+          <w:caps w:val="0"/>
+          <w:color w:val="303030"/>
+          <w:spacing w:val="0"/>
+          <w:sz w:val="52"/>
+          <w:szCs w:val="52"/>
+          <w:shd w:val="clear" w:fill="FFFFFF"/>
+          <w:lang w:val="ru-RU"/>
+        </w:rPr>
+        <w:t>Атрибуты тегов</w:t>
+      </w:r>
+    </w:p>
+    <w:p>
+      <w:pPr>
+        <w:numPr>
+          <w:ilvl w:val="0"/>
+          <w:numId w:val="0"/>
+        </w:numPr>
+        <w:rPr>
+          <w:rFonts w:hint="default" w:ascii="Trebuchet MS" w:hAnsi="Trebuchet MS" w:eastAsia="SimSun" w:cs="Trebuchet MS"/>
+          <w:i w:val="0"/>
+          <w:iCs w:val="0"/>
+          <w:caps w:val="0"/>
+          <w:color w:val="303030"/>
+          <w:spacing w:val="0"/>
+          <w:sz w:val="21"/>
+          <w:szCs w:val="21"/>
+          <w:shd w:val="clear" w:fill="FFFFFF"/>
+          <w:lang w:val="ru-RU"/>
+        </w:rPr>
+      </w:pPr>
+    </w:p>
+    <w:p>
+      <w:pPr>
+        <w:numPr>
+          <w:ilvl w:val="0"/>
+          <w:numId w:val="2"/>
+        </w:numPr>
+        <w:rPr>
+          <w:rFonts w:hint="default" w:ascii="Trebuchet MS" w:hAnsi="Trebuchet MS" w:eastAsia="SimSun" w:cs="Trebuchet MS"/>
+          <w:i w:val="0"/>
+          <w:iCs w:val="0"/>
+          <w:caps w:val="0"/>
+          <w:color w:val="303030"/>
+          <w:spacing w:val="0"/>
+          <w:sz w:val="21"/>
+          <w:szCs w:val="21"/>
+          <w:shd w:val="clear" w:fill="FFFFFF"/>
+          <w:lang w:val="en-US"/>
+        </w:rPr>
+      </w:pPr>
+      <w:r>
+        <w:rPr>
+          <w:rFonts w:hint="default" w:ascii="Trebuchet MS" w:hAnsi="Trebuchet MS" w:eastAsia="SimSun" w:cs="Trebuchet MS"/>
+          <w:i w:val="0"/>
+          <w:iCs w:val="0"/>
+          <w:color w:val="303030"/>
+          <w:spacing w:val="0"/>
+          <w:sz w:val="21"/>
+          <w:szCs w:val="21"/>
+          <w:shd w:val="clear" w:fill="FFFFFF"/>
+          <w:lang w:val="en-US"/>
+        </w:rPr>
+        <w:t>C</w:t>
+      </w:r>
+      <w:r>
+        <w:rPr>
+          <w:rFonts w:hint="default" w:ascii="Trebuchet MS" w:hAnsi="Trebuchet MS" w:eastAsia="SimSun" w:cs="Trebuchet MS"/>
+          <w:i w:val="0"/>
+          <w:iCs w:val="0"/>
+          <w:caps w:val="0"/>
+          <w:color w:val="303030"/>
+          <w:spacing w:val="0"/>
+          <w:sz w:val="21"/>
+          <w:szCs w:val="21"/>
+          <w:shd w:val="clear" w:fill="FFFFFF"/>
+          <w:lang w:val="en-US"/>
+        </w:rPr>
+        <w:t>lass - CSS-</w:t>
+      </w:r>
+      <w:r>
+        <w:rPr>
+          <w:rFonts w:hint="default" w:ascii="Trebuchet MS" w:hAnsi="Trebuchet MS" w:eastAsia="SimSun" w:cs="Trebuchet MS"/>
+          <w:i w:val="0"/>
+          <w:iCs w:val="0"/>
+          <w:caps w:val="0"/>
+          <w:color w:val="303030"/>
+          <w:spacing w:val="0"/>
+          <w:sz w:val="21"/>
+          <w:szCs w:val="21"/>
+          <w:shd w:val="clear" w:fill="FFFFFF"/>
+          <w:lang w:val="ru-RU"/>
+        </w:rPr>
+        <w:t>класс который позволяет идентифицуировать элемент, задать свойства конкретному элементу или ряду элементов с таким же названием.</w:t>
+      </w:r>
+    </w:p>
+    <w:p>
+      <w:pPr>
+        <w:numPr>
+          <w:ilvl w:val="0"/>
+          <w:numId w:val="2"/>
+        </w:numPr>
+        <w:rPr>
+          <w:rFonts w:hint="default" w:ascii="Trebuchet MS" w:hAnsi="Trebuchet MS" w:eastAsia="SimSun" w:cs="Trebuchet MS"/>
+          <w:i w:val="0"/>
+          <w:iCs w:val="0"/>
+          <w:caps w:val="0"/>
+          <w:color w:val="303030"/>
+          <w:spacing w:val="0"/>
+          <w:sz w:val="21"/>
+          <w:szCs w:val="21"/>
+          <w:shd w:val="clear" w:fill="FFFFFF"/>
+          <w:lang w:val="en-US"/>
+        </w:rPr>
+      </w:pPr>
+      <w:r>
+        <w:rPr>
+          <w:rFonts w:hint="default" w:ascii="Trebuchet MS" w:hAnsi="Trebuchet MS" w:eastAsia="SimSun" w:cs="Trebuchet MS"/>
+          <w:i w:val="0"/>
+          <w:iCs w:val="0"/>
+          <w:color w:val="303030"/>
+          <w:spacing w:val="0"/>
+          <w:sz w:val="21"/>
+          <w:szCs w:val="21"/>
+          <w:shd w:val="clear" w:fill="FFFFFF"/>
+          <w:lang w:val="en-US"/>
+        </w:rPr>
+        <w:t>I</w:t>
+      </w:r>
+      <w:r>
+        <w:rPr>
+          <w:rFonts w:hint="default" w:ascii="Trebuchet MS" w:hAnsi="Trebuchet MS" w:eastAsia="SimSun" w:cs="Trebuchet MS"/>
+          <w:i w:val="0"/>
+          <w:iCs w:val="0"/>
+          <w:caps w:val="0"/>
+          <w:color w:val="303030"/>
+          <w:spacing w:val="0"/>
+          <w:sz w:val="21"/>
+          <w:szCs w:val="21"/>
+          <w:shd w:val="clear" w:fill="FFFFFF"/>
+          <w:lang w:val="en-US"/>
+        </w:rPr>
+        <w:t xml:space="preserve">d - </w:t>
+      </w:r>
+      <w:r>
+        <w:rPr>
+          <w:rFonts w:hint="default" w:ascii="Trebuchet MS" w:hAnsi="Trebuchet MS" w:eastAsia="SimSun" w:cs="Trebuchet MS"/>
+          <w:i w:val="0"/>
+          <w:iCs w:val="0"/>
+          <w:caps w:val="0"/>
+          <w:color w:val="303030"/>
+          <w:spacing w:val="0"/>
+          <w:sz w:val="21"/>
+          <w:szCs w:val="21"/>
+          <w:shd w:val="clear" w:fill="FFFFFF"/>
+          <w:lang w:val="ru-RU"/>
+        </w:rPr>
+        <w:t xml:space="preserve">то же что и </w:t>
+      </w:r>
+      <w:r>
+        <w:rPr>
+          <w:rFonts w:hint="default" w:ascii="Trebuchet MS" w:hAnsi="Trebuchet MS" w:eastAsia="SimSun" w:cs="Trebuchet MS"/>
+          <w:i w:val="0"/>
+          <w:iCs w:val="0"/>
+          <w:caps w:val="0"/>
+          <w:color w:val="303030"/>
+          <w:spacing w:val="0"/>
+          <w:sz w:val="21"/>
+          <w:szCs w:val="21"/>
+          <w:shd w:val="clear" w:fill="FFFFFF"/>
+          <w:lang w:val="en-US"/>
+        </w:rPr>
+        <w:t>class</w:t>
+      </w:r>
+      <w:r>
+        <w:rPr>
+          <w:rFonts w:hint="default" w:ascii="Trebuchet MS" w:hAnsi="Trebuchet MS" w:eastAsia="SimSun" w:cs="Trebuchet MS"/>
+          <w:i w:val="0"/>
+          <w:iCs w:val="0"/>
+          <w:caps w:val="0"/>
+          <w:color w:val="303030"/>
+          <w:spacing w:val="0"/>
+          <w:sz w:val="21"/>
+          <w:szCs w:val="21"/>
+          <w:shd w:val="clear" w:fill="FFFFFF"/>
+          <w:lang w:val="ru-RU"/>
+        </w:rPr>
+        <w:t xml:space="preserve"> позволяет идентифицировать элемент </w:t>
+      </w:r>
+      <w:r>
+        <w:rPr>
+          <w:rFonts w:hint="default" w:ascii="Trebuchet MS" w:hAnsi="Trebuchet MS" w:eastAsia="SimSun" w:cs="Trebuchet MS"/>
+          <w:i w:val="0"/>
+          <w:iCs w:val="0"/>
+          <w:caps w:val="0"/>
+          <w:color w:val="303030"/>
+          <w:spacing w:val="0"/>
+          <w:sz w:val="21"/>
+          <w:szCs w:val="21"/>
+          <w:shd w:val="clear" w:fill="FFFFFF"/>
+          <w:lang w:val="en-US"/>
+        </w:rPr>
+        <w:t>(</w:t>
+      </w:r>
+      <w:r>
+        <w:rPr>
+          <w:rFonts w:hint="default" w:ascii="Trebuchet MS" w:hAnsi="Trebuchet MS" w:eastAsia="SimSun" w:cs="Trebuchet MS"/>
+          <w:i w:val="0"/>
+          <w:iCs w:val="0"/>
+          <w:caps w:val="0"/>
+          <w:color w:val="303030"/>
+          <w:spacing w:val="0"/>
+          <w:sz w:val="21"/>
+          <w:szCs w:val="21"/>
+          <w:shd w:val="clear" w:fill="FFFFFF"/>
+          <w:lang w:val="ru-RU"/>
+        </w:rPr>
+        <w:t xml:space="preserve">чаще всего для привязки </w:t>
+      </w:r>
+      <w:r>
+        <w:rPr>
+          <w:rFonts w:hint="default" w:ascii="Trebuchet MS" w:hAnsi="Trebuchet MS" w:eastAsia="SimSun" w:cs="Trebuchet MS"/>
+          <w:i w:val="0"/>
+          <w:iCs w:val="0"/>
+          <w:caps w:val="0"/>
+          <w:color w:val="303030"/>
+          <w:spacing w:val="0"/>
+          <w:sz w:val="21"/>
+          <w:szCs w:val="21"/>
+          <w:shd w:val="clear" w:fill="FFFFFF"/>
+          <w:lang w:val="en-US"/>
+        </w:rPr>
+        <w:t>JS-</w:t>
+      </w:r>
+      <w:r>
+        <w:rPr>
+          <w:rFonts w:hint="default" w:ascii="Trebuchet MS" w:hAnsi="Trebuchet MS" w:eastAsia="SimSun" w:cs="Trebuchet MS"/>
+          <w:i w:val="0"/>
+          <w:iCs w:val="0"/>
+          <w:caps w:val="0"/>
+          <w:color w:val="303030"/>
+          <w:spacing w:val="0"/>
+          <w:sz w:val="21"/>
+          <w:szCs w:val="21"/>
+          <w:shd w:val="clear" w:fill="FFFFFF"/>
+          <w:lang w:val="ru-RU"/>
+        </w:rPr>
+        <w:t>скриптов).</w:t>
+      </w:r>
+    </w:p>
+    <w:p>
+      <w:pPr>
+        <w:numPr>
+          <w:ilvl w:val="0"/>
+          <w:numId w:val="2"/>
+        </w:numPr>
+        <w:rPr>
+          <w:rFonts w:hint="default" w:ascii="Trebuchet MS" w:hAnsi="Trebuchet MS" w:eastAsia="SimSun" w:cs="Trebuchet MS"/>
+          <w:i w:val="0"/>
+          <w:iCs w:val="0"/>
+          <w:caps w:val="0"/>
+          <w:color w:val="303030"/>
+          <w:spacing w:val="0"/>
+          <w:sz w:val="21"/>
+          <w:szCs w:val="21"/>
+          <w:shd w:val="clear" w:fill="FFFFFF"/>
+          <w:lang w:val="en-US"/>
+        </w:rPr>
+      </w:pPr>
+      <w:r>
+        <w:rPr>
+          <w:rFonts w:hint="default" w:ascii="Trebuchet MS" w:hAnsi="Trebuchet MS" w:eastAsia="SimSun" w:cs="Trebuchet MS"/>
+          <w:i w:val="0"/>
+          <w:iCs w:val="0"/>
+          <w:color w:val="303030"/>
+          <w:spacing w:val="0"/>
+          <w:sz w:val="21"/>
+          <w:szCs w:val="21"/>
+          <w:shd w:val="clear" w:fill="FFFFFF"/>
+          <w:lang w:val="en-US"/>
+        </w:rPr>
+        <w:t>H</w:t>
+      </w:r>
+      <w:r>
+        <w:rPr>
+          <w:rFonts w:hint="default" w:ascii="Trebuchet MS" w:hAnsi="Trebuchet MS" w:eastAsia="SimSun" w:cs="Trebuchet MS"/>
+          <w:i w:val="0"/>
+          <w:iCs w:val="0"/>
+          <w:caps w:val="0"/>
+          <w:color w:val="303030"/>
+          <w:spacing w:val="0"/>
+          <w:sz w:val="21"/>
+          <w:szCs w:val="21"/>
+          <w:shd w:val="clear" w:fill="FFFFFF"/>
+          <w:lang w:val="en-US"/>
+        </w:rPr>
+        <w:t xml:space="preserve">ref - </w:t>
+      </w:r>
+      <w:r>
+        <w:rPr>
+          <w:rFonts w:hint="default" w:ascii="Trebuchet MS" w:hAnsi="Trebuchet MS" w:eastAsia="SimSun" w:cs="Trebuchet MS"/>
+          <w:i w:val="0"/>
+          <w:iCs w:val="0"/>
+          <w:caps w:val="0"/>
+          <w:color w:val="303030"/>
+          <w:spacing w:val="0"/>
+          <w:sz w:val="21"/>
+          <w:szCs w:val="21"/>
+          <w:shd w:val="clear" w:fill="FFFFFF"/>
+          <w:lang w:val="ru-RU"/>
+        </w:rPr>
+        <w:t xml:space="preserve">указывает адрес ссылки. </w:t>
+      </w:r>
+      <w:r>
+        <w:rPr>
+          <w:rFonts w:hint="default" w:ascii="Trebuchet MS" w:hAnsi="Trebuchet MS" w:eastAsia="SimSun" w:cs="Trebuchet MS"/>
+          <w:i w:val="0"/>
+          <w:iCs w:val="0"/>
+          <w:color w:val="303030"/>
+          <w:spacing w:val="0"/>
+          <w:sz w:val="21"/>
+          <w:szCs w:val="21"/>
+          <w:shd w:val="clear" w:fill="FFFFFF"/>
+          <w:lang w:val="ru-RU"/>
+        </w:rPr>
+        <w:t>Ч</w:t>
+      </w:r>
+      <w:r>
+        <w:rPr>
+          <w:rFonts w:hint="default" w:ascii="Trebuchet MS" w:hAnsi="Trebuchet MS" w:eastAsia="SimSun" w:cs="Trebuchet MS"/>
+          <w:i w:val="0"/>
+          <w:iCs w:val="0"/>
+          <w:caps w:val="0"/>
+          <w:color w:val="303030"/>
+          <w:spacing w:val="0"/>
+          <w:sz w:val="21"/>
+          <w:szCs w:val="21"/>
+          <w:shd w:val="clear" w:fill="FFFFFF"/>
+          <w:lang w:val="ru-RU"/>
+        </w:rPr>
+        <w:t xml:space="preserve">аще всего применяется к тегу </w:t>
+      </w:r>
+      <w:r>
+        <w:rPr>
+          <w:rFonts w:hint="default" w:ascii="Trebuchet MS" w:hAnsi="Trebuchet MS" w:eastAsia="SimSun" w:cs="Trebuchet MS"/>
+          <w:i w:val="0"/>
+          <w:iCs w:val="0"/>
+          <w:caps w:val="0"/>
+          <w:color w:val="303030"/>
+          <w:spacing w:val="0"/>
+          <w:sz w:val="21"/>
+          <w:szCs w:val="21"/>
+          <w:shd w:val="clear" w:fill="FFFFFF"/>
+          <w:lang w:val="en-US"/>
+        </w:rPr>
+        <w:t>&lt;a&gt;</w:t>
+      </w:r>
+    </w:p>
+    <w:p>
+      <w:pPr>
+        <w:numPr>
+          <w:ilvl w:val="0"/>
+          <w:numId w:val="2"/>
+        </w:numPr>
+        <w:rPr>
+          <w:rFonts w:hint="default" w:ascii="Trebuchet MS" w:hAnsi="Trebuchet MS" w:eastAsia="SimSun" w:cs="Trebuchet MS"/>
+          <w:i w:val="0"/>
+          <w:iCs w:val="0"/>
+          <w:caps w:val="0"/>
+          <w:color w:val="303030"/>
+          <w:spacing w:val="0"/>
+          <w:sz w:val="21"/>
+          <w:szCs w:val="21"/>
+          <w:shd w:val="clear" w:fill="FFFFFF"/>
+          <w:lang w:val="en-US"/>
+        </w:rPr>
+      </w:pPr>
+      <w:r>
+        <w:rPr>
+          <w:rFonts w:hint="default" w:ascii="Trebuchet MS" w:hAnsi="Trebuchet MS" w:eastAsia="SimSun" w:cs="Trebuchet MS"/>
+          <w:i w:val="0"/>
+          <w:iCs w:val="0"/>
+          <w:color w:val="303030"/>
+          <w:spacing w:val="0"/>
+          <w:sz w:val="21"/>
+          <w:szCs w:val="21"/>
+          <w:shd w:val="clear" w:fill="FFFFFF"/>
+          <w:lang w:val="en-US"/>
+        </w:rPr>
+        <w:t>S</w:t>
+      </w:r>
+      <w:r>
+        <w:rPr>
+          <w:rFonts w:hint="default" w:ascii="Trebuchet MS" w:hAnsi="Trebuchet MS" w:eastAsia="SimSun" w:cs="Trebuchet MS"/>
+          <w:i w:val="0"/>
+          <w:iCs w:val="0"/>
+          <w:caps w:val="0"/>
+          <w:color w:val="303030"/>
+          <w:spacing w:val="0"/>
+          <w:sz w:val="21"/>
+          <w:szCs w:val="21"/>
+          <w:shd w:val="clear" w:fill="FFFFFF"/>
+          <w:lang w:val="en-US"/>
+        </w:rPr>
+        <w:t xml:space="preserve">rc - </w:t>
+      </w:r>
+      <w:r>
+        <w:rPr>
+          <w:rFonts w:hint="default" w:ascii="Trebuchet MS" w:hAnsi="Trebuchet MS" w:eastAsia="SimSun" w:cs="Trebuchet MS"/>
+          <w:i w:val="0"/>
+          <w:iCs w:val="0"/>
+          <w:caps w:val="0"/>
+          <w:color w:val="303030"/>
+          <w:spacing w:val="0"/>
+          <w:sz w:val="21"/>
+          <w:szCs w:val="21"/>
+          <w:shd w:val="clear" w:fill="FFFFFF"/>
+          <w:lang w:val="ru-RU"/>
+        </w:rPr>
+        <w:t>путь к файлу изображения</w:t>
+      </w:r>
     </w:p>
     <w:p>
       <w:pPr>
@@ -2762,23 +4377,59 @@
           <w:sz w:val="21"/>
           <w:szCs w:val="21"/>
           <w:shd w:val="clear" w:fill="FFFFFF"/>
-          <w:lang w:val="ru-RU"/>
-        </w:rPr>
-      </w:pPr>
-      <w:r>
-        <w:rPr>
-          <w:rFonts w:hint="default" w:ascii="Trebuchet MS" w:hAnsi="Trebuchet MS" w:eastAsia="SimSun" w:cs="Trebuchet MS"/>
-          <w:i w:val="0"/>
-          <w:iCs w:val="0"/>
-          <w:caps w:val="0"/>
-          <w:color w:val="303030"/>
-          <w:spacing w:val="0"/>
-          <w:sz w:val="21"/>
-          <w:szCs w:val="21"/>
-          <w:shd w:val="clear" w:fill="FFFFFF"/>
-          <w:lang w:val="ru-RU"/>
-        </w:rPr>
-        <w:t>Заголовки и текст</w:t>
+          <w:lang w:val="en-US"/>
+        </w:rPr>
+      </w:pPr>
+      <w:r>
+        <w:rPr>
+          <w:rFonts w:hint="default" w:ascii="Trebuchet MS" w:hAnsi="Trebuchet MS" w:eastAsia="SimSun" w:cs="Trebuchet MS"/>
+          <w:i w:val="0"/>
+          <w:iCs w:val="0"/>
+          <w:caps w:val="0"/>
+          <w:color w:val="303030"/>
+          <w:spacing w:val="0"/>
+          <w:sz w:val="21"/>
+          <w:szCs w:val="21"/>
+          <w:shd w:val="clear" w:fill="FFFFFF"/>
+          <w:lang w:val="en-US"/>
+        </w:rPr>
+        <w:drawing>
+          <wp:inline distT="0" distB="0" distL="114300" distR="114300">
+            <wp:extent cx="5481320" cy="2324735"/>
+            <wp:effectExtent l="0" t="0" r="5080" b="18415"/>
+            <wp:docPr id="7" name="Изображение 7" descr="{BE47E883-7754-44E8-A5F6-87A189BC5D6F}"/>
+            <wp:cNvGraphicFramePr>
+              <a:graphicFrameLocks xmlns:a="http://schemas.openxmlformats.org/drawingml/2006/main" noChangeAspect="1"/>
+            </wp:cNvGraphicFramePr>
+            <a:graphic xmlns:a="http://schemas.openxmlformats.org/drawingml/2006/main">
+              <a:graphicData uri="http://schemas.openxmlformats.org/drawingml/2006/picture">
+                <pic:pic xmlns:pic="http://schemas.openxmlformats.org/drawingml/2006/picture">
+                  <pic:nvPicPr>
+                    <pic:cNvPr id="7" name="Изображение 7" descr="{BE47E883-7754-44E8-A5F6-87A189BC5D6F}"/>
+                    <pic:cNvPicPr>
+                      <a:picLocks noChangeAspect="1"/>
+                    </pic:cNvPicPr>
+                  </pic:nvPicPr>
+                  <pic:blipFill>
+                    <a:blip r:embed="rId9"/>
+                    <a:stretch>
+                      <a:fillRect/>
+                    </a:stretch>
+                  </pic:blipFill>
+                  <pic:spPr>
+                    <a:xfrm>
+                      <a:off x="0" y="0"/>
+                      <a:ext cx="5481320" cy="2324735"/>
+                    </a:xfrm>
+                    <a:prstGeom prst="rect">
+                      <a:avLst/>
+                    </a:prstGeom>
+                  </pic:spPr>
+                </pic:pic>
+              </a:graphicData>
+            </a:graphic>
+          </wp:inline>
+        </w:drawing>
       </w:r>
     </w:p>
     <w:p>
@@ -2799,21 +4450,6 @@
           <w:lang w:val="en-US"/>
         </w:rPr>
       </w:pPr>
-      <w:r>
-        <w:rPr>
-          <w:rFonts w:hint="default" w:ascii="Trebuchet MS" w:hAnsi="Trebuchet MS" w:eastAsia="SimSun" w:cs="Trebuchet MS"/>
-          <w:i w:val="0"/>
-          <w:iCs w:val="0"/>
-          <w:caps w:val="0"/>
-          <w:color w:val="303030"/>
-          <w:spacing w:val="0"/>
-          <w:sz w:val="21"/>
-          <w:szCs w:val="21"/>
-          <w:shd w:val="clear" w:fill="FFFFFF"/>
-          <w:lang w:val="en-US"/>
-        </w:rPr>
-        <w:t>&lt;h1&gt;&lt;h6&gt;</w:t>
-      </w:r>
     </w:p>
     <w:p>
       <w:pPr>
@@ -2830,23 +4466,38 @@
           <w:sz w:val="21"/>
           <w:szCs w:val="21"/>
           <w:shd w:val="clear" w:fill="FFFFFF"/>
-          <w:lang w:val="en-US"/>
-        </w:rPr>
-      </w:pPr>
-      <w:r>
-        <w:rPr>
-          <w:rFonts w:hint="default" w:ascii="Trebuchet MS" w:hAnsi="Trebuchet MS" w:eastAsia="SimSun" w:cs="Trebuchet MS"/>
-          <w:i w:val="0"/>
-          <w:iCs w:val="0"/>
-          <w:caps w:val="0"/>
-          <w:color w:val="303030"/>
-          <w:spacing w:val="0"/>
-          <w:sz w:val="21"/>
-          <w:szCs w:val="21"/>
-          <w:shd w:val="clear" w:fill="FFFFFF"/>
-          <w:lang w:val="en-US"/>
-        </w:rPr>
-        <w:t>&lt;/h1&gt;&lt;/h6&gt;</w:t>
+          <w:lang w:val="ru-RU"/>
+        </w:rPr>
+      </w:pPr>
+      <w:r>
+        <w:rPr>
+          <w:rFonts w:hint="default" w:ascii="Trebuchet MS" w:hAnsi="Trebuchet MS" w:eastAsia="SimSun" w:cs="Trebuchet MS"/>
+          <w:i w:val="0"/>
+          <w:iCs w:val="0"/>
+          <w:caps w:val="0"/>
+          <w:color w:val="303030"/>
+          <w:spacing w:val="0"/>
+          <w:sz w:val="21"/>
+          <w:szCs w:val="21"/>
+          <w:shd w:val="clear" w:fill="FFFFFF"/>
+          <w:lang w:val="ru-RU"/>
+        </w:rPr>
+        <w:t xml:space="preserve">Подключение файла стилей к документу </w:t>
+      </w:r>
+      <w:r>
+        <w:rPr>
+          <w:rFonts w:hint="default" w:ascii="Trebuchet MS" w:hAnsi="Trebuchet MS" w:eastAsia="SimSun" w:cs="Trebuchet MS"/>
+          <w:i w:val="0"/>
+          <w:iCs w:val="0"/>
+          <w:caps w:val="0"/>
+          <w:color w:val="303030"/>
+          <w:spacing w:val="0"/>
+          <w:sz w:val="21"/>
+          <w:szCs w:val="21"/>
+          <w:shd w:val="clear" w:fill="FFFFFF"/>
+          <w:lang w:val="en-US"/>
+        </w:rPr>
+        <w:t>html</w:t>
       </w:r>
     </w:p>
     <w:p>
@@ -2872,15 +4523,74 @@
           <w:rFonts w:hint="default" w:ascii="Trebuchet MS" w:hAnsi="Trebuchet MS" w:eastAsia="SimSun" w:cs="Trebuchet MS"/>
           <w:i w:val="0"/>
           <w:iCs w:val="0"/>
-          <w:caps w:val="0"/>
-          <w:color w:val="303030"/>
-          <w:spacing w:val="0"/>
-          <w:sz w:val="21"/>
-          <w:szCs w:val="21"/>
-          <w:shd w:val="clear" w:fill="FFFFFF"/>
-          <w:lang w:val="en-US"/>
-        </w:rPr>
-        <w:t>&lt;p&gt;&lt;/p&gt;</w:t>
+          <w:color w:val="303030"/>
+          <w:spacing w:val="0"/>
+          <w:sz w:val="21"/>
+          <w:szCs w:val="21"/>
+          <w:shd w:val="clear" w:fill="FFFFFF"/>
+          <w:lang w:val="ru-RU"/>
+        </w:rPr>
+        <w:t>Ч</w:t>
+      </w:r>
+      <w:r>
+        <w:rPr>
+          <w:rFonts w:hint="default" w:ascii="Trebuchet MS" w:hAnsi="Trebuchet MS" w:eastAsia="SimSun" w:cs="Trebuchet MS"/>
+          <w:i w:val="0"/>
+          <w:iCs w:val="0"/>
+          <w:caps w:val="0"/>
+          <w:color w:val="303030"/>
+          <w:spacing w:val="0"/>
+          <w:sz w:val="21"/>
+          <w:szCs w:val="21"/>
+          <w:shd w:val="clear" w:fill="FFFFFF"/>
+          <w:lang w:val="ru-RU"/>
+        </w:rPr>
+        <w:t xml:space="preserve">ерез тег </w:t>
+      </w:r>
+      <w:r>
+        <w:rPr>
+          <w:rFonts w:hint="default" w:ascii="Trebuchet MS" w:hAnsi="Trebuchet MS" w:eastAsia="SimSun" w:cs="Trebuchet MS"/>
+          <w:i w:val="0"/>
+          <w:iCs w:val="0"/>
+          <w:caps w:val="0"/>
+          <w:color w:val="303030"/>
+          <w:spacing w:val="0"/>
+          <w:sz w:val="21"/>
+          <w:szCs w:val="21"/>
+          <w:shd w:val="clear" w:fill="FFFFFF"/>
+          <w:lang w:val="en-US"/>
+        </w:rPr>
+        <w:t>&lt;link</w:t>
+      </w:r>
+      <w:r>
+        <w:rPr>
+          <w:rFonts w:hint="default" w:ascii="Trebuchet MS" w:hAnsi="Trebuchet MS" w:eastAsia="SimSun" w:cs="Trebuchet MS"/>
+          <w:i w:val="0"/>
+          <w:iCs w:val="0"/>
+          <w:caps w:val="0"/>
+          <w:color w:val="303030"/>
+          <w:spacing w:val="0"/>
+          <w:sz w:val="21"/>
+          <w:szCs w:val="21"/>
+          <w:shd w:val="clear" w:fill="FFFFFF"/>
+          <w:lang w:val="ru-RU"/>
+        </w:rPr>
+        <w:t xml:space="preserve"> </w:t>
+      </w:r>
+      <w:r>
+        <w:rPr>
+          <w:rFonts w:hint="default" w:ascii="Trebuchet MS" w:hAnsi="Trebuchet MS" w:eastAsia="SimSun" w:cs="Trebuchet MS"/>
+          <w:i w:val="0"/>
+          <w:iCs w:val="0"/>
+          <w:caps w:val="0"/>
+          <w:color w:val="303030"/>
+          <w:spacing w:val="0"/>
+          <w:sz w:val="21"/>
+          <w:szCs w:val="21"/>
+          <w:shd w:val="clear" w:fill="FFFFFF"/>
+          <w:lang w:val="en-US"/>
+        </w:rPr>
+        <w:t>rel=”stylesheet” href=”./---.css”&gt;</w:t>
       </w:r>
     </w:p>
     <w:p>
@@ -2898,52 +4608,82 @@
           <w:sz w:val="21"/>
           <w:szCs w:val="21"/>
           <w:shd w:val="clear" w:fill="FFFFFF"/>
-          <w:lang w:val="ru-RU"/>
-        </w:rPr>
-      </w:pPr>
-      <w:r>
-        <w:rPr>
-          <w:rFonts w:hint="default" w:ascii="Trebuchet MS" w:hAnsi="Trebuchet MS" w:eastAsia="SimSun" w:cs="Trebuchet MS"/>
-          <w:i w:val="0"/>
-          <w:iCs w:val="0"/>
-          <w:color w:val="303030"/>
-          <w:spacing w:val="0"/>
-          <w:sz w:val="21"/>
-          <w:szCs w:val="21"/>
-          <w:shd w:val="clear" w:fill="FFFFFF"/>
-          <w:lang w:val="en-US"/>
-        </w:rPr>
-        <w:t>P</w:t>
-      </w:r>
-      <w:r>
-        <w:rPr>
-          <w:rFonts w:hint="default" w:ascii="Trebuchet MS" w:hAnsi="Trebuchet MS" w:eastAsia="SimSun" w:cs="Trebuchet MS"/>
-          <w:i w:val="0"/>
-          <w:iCs w:val="0"/>
-          <w:caps w:val="0"/>
-          <w:color w:val="303030"/>
-          <w:spacing w:val="0"/>
-          <w:sz w:val="21"/>
-          <w:szCs w:val="21"/>
-          <w:shd w:val="clear" w:fill="FFFFFF"/>
-          <w:lang w:val="en-US"/>
-        </w:rPr>
-        <w:t xml:space="preserve"> - </w:t>
-      </w:r>
-      <w:r>
-        <w:rPr>
-          <w:rFonts w:hint="default" w:ascii="Trebuchet MS" w:hAnsi="Trebuchet MS" w:eastAsia="SimSun" w:cs="Trebuchet MS"/>
-          <w:i w:val="0"/>
-          <w:iCs w:val="0"/>
-          <w:caps w:val="0"/>
-          <w:color w:val="303030"/>
-          <w:spacing w:val="0"/>
-          <w:sz w:val="21"/>
-          <w:szCs w:val="21"/>
-          <w:shd w:val="clear" w:fill="FFFFFF"/>
-          <w:lang w:val="ru-RU"/>
-        </w:rPr>
-        <w:t>параграфы в тексте</w:t>
+          <w:lang w:val="en-US"/>
+        </w:rPr>
+      </w:pPr>
+      <w:r>
+        <w:rPr>
+          <w:rFonts w:hint="default" w:ascii="Trebuchet MS" w:hAnsi="Trebuchet MS" w:eastAsia="SimSun" w:cs="Trebuchet MS"/>
+          <w:i w:val="0"/>
+          <w:iCs w:val="0"/>
+          <w:color w:val="303030"/>
+          <w:spacing w:val="0"/>
+          <w:sz w:val="21"/>
+          <w:szCs w:val="21"/>
+          <w:shd w:val="clear" w:fill="FFFFFF"/>
+          <w:lang w:val="ru-RU"/>
+        </w:rPr>
+        <w:t>Т</w:t>
+      </w:r>
+      <w:r>
+        <w:rPr>
+          <w:rFonts w:hint="default" w:ascii="Trebuchet MS" w:hAnsi="Trebuchet MS" w:eastAsia="SimSun" w:cs="Trebuchet MS"/>
+          <w:i w:val="0"/>
+          <w:iCs w:val="0"/>
+          <w:caps w:val="0"/>
+          <w:color w:val="303030"/>
+          <w:spacing w:val="0"/>
+          <w:sz w:val="21"/>
+          <w:szCs w:val="21"/>
+          <w:shd w:val="clear" w:fill="FFFFFF"/>
+          <w:lang w:val="ru-RU"/>
+        </w:rPr>
+        <w:t xml:space="preserve">ег </w:t>
+      </w:r>
+      <w:r>
+        <w:rPr>
+          <w:rFonts w:hint="default" w:ascii="Trebuchet MS" w:hAnsi="Trebuchet MS" w:eastAsia="SimSun" w:cs="Trebuchet MS"/>
+          <w:i w:val="0"/>
+          <w:iCs w:val="0"/>
+          <w:caps w:val="0"/>
+          <w:color w:val="303030"/>
+          <w:spacing w:val="0"/>
+          <w:sz w:val="21"/>
+          <w:szCs w:val="21"/>
+          <w:shd w:val="clear" w:fill="FFFFFF"/>
+          <w:lang w:val="en-US"/>
+        </w:rPr>
+        <w:t xml:space="preserve">link </w:t>
+      </w:r>
+      <w:r>
+        <w:rPr>
+          <w:rFonts w:hint="default" w:ascii="Trebuchet MS" w:hAnsi="Trebuchet MS" w:eastAsia="SimSun" w:cs="Trebuchet MS"/>
+          <w:i w:val="0"/>
+          <w:iCs w:val="0"/>
+          <w:caps w:val="0"/>
+          <w:color w:val="303030"/>
+          <w:spacing w:val="0"/>
+          <w:sz w:val="21"/>
+          <w:szCs w:val="21"/>
+          <w:shd w:val="clear" w:fill="FFFFFF"/>
+          <w:lang w:val="ru-RU"/>
+        </w:rPr>
+        <w:t xml:space="preserve">пишется в </w:t>
+      </w:r>
+      <w:r>
+        <w:rPr>
+          <w:rFonts w:hint="default" w:ascii="Trebuchet MS" w:hAnsi="Trebuchet MS" w:eastAsia="SimSun" w:cs="Trebuchet MS"/>
+          <w:i w:val="0"/>
+          <w:iCs w:val="0"/>
+          <w:caps w:val="0"/>
+          <w:color w:val="303030"/>
+          <w:spacing w:val="0"/>
+          <w:sz w:val="21"/>
+          <w:szCs w:val="21"/>
+          <w:shd w:val="clear" w:fill="FFFFFF"/>
+          <w:lang w:val="en-US"/>
+        </w:rPr>
+        <w:t>head</w:t>
       </w:r>
     </w:p>
     <w:p>
@@ -2964,35 +4704,6 @@
           <w:lang w:val="en-US"/>
         </w:rPr>
       </w:pPr>
-      <w:r>
-        <w:rPr>
-          <w:rFonts w:hint="default" w:ascii="Trebuchet MS" w:hAnsi="Trebuchet MS" w:eastAsia="SimSun" w:cs="Trebuchet MS"/>
-          <w:i w:val="0"/>
-          <w:iCs w:val="0"/>
-          <w:color w:val="303030"/>
-          <w:spacing w:val="0"/>
-          <w:sz w:val="21"/>
-          <w:szCs w:val="21"/>
-          <w:shd w:val="clear" w:fill="FFFFFF"/>
-          <w:lang w:val="en-US"/>
-        </w:rPr>
-        <w:t>&lt;S</w:t>
-      </w:r>
-      <w:r>
-        <w:rPr>
-          <w:rFonts w:hint="default" w:ascii="Trebuchet MS" w:hAnsi="Trebuchet MS" w:eastAsia="SimSun" w:cs="Trebuchet MS"/>
-          <w:i w:val="0"/>
-          <w:iCs w:val="0"/>
-          <w:caps w:val="0"/>
-          <w:color w:val="303030"/>
-          <w:spacing w:val="0"/>
-          <w:sz w:val="21"/>
-          <w:szCs w:val="21"/>
-          <w:shd w:val="clear" w:fill="FFFFFF"/>
-          <w:lang w:val="en-US"/>
-        </w:rPr>
-        <w:t>trong&gt;&lt;/strong&gt;</w:t>
-      </w:r>
     </w:p>
     <w:p>
       <w:pPr>
@@ -3023,323 +4734,55 @@
           <w:sz w:val="21"/>
           <w:szCs w:val="21"/>
           <w:shd w:val="clear" w:fill="FFFFFF"/>
-          <w:lang w:val="en-US"/>
-        </w:rPr>
-        <w:t>&lt;em&gt;&lt;/em&gt;</w:t>
-      </w:r>
-    </w:p>
-    <w:p>
-      <w:pPr>
-        <w:numPr>
-          <w:numId w:val="0"/>
-        </w:numPr>
-        <w:rPr>
-          <w:rFonts w:hint="default" w:ascii="Trebuchet MS" w:hAnsi="Trebuchet MS" w:eastAsia="SimSun" w:cs="Trebuchet MS"/>
-          <w:i w:val="0"/>
-          <w:iCs w:val="0"/>
-          <w:caps w:val="0"/>
-          <w:color w:val="303030"/>
-          <w:spacing w:val="0"/>
-          <w:sz w:val="21"/>
-          <w:szCs w:val="21"/>
-          <w:shd w:val="clear" w:fill="FFFFFF"/>
-          <w:lang w:val="en-US"/>
-        </w:rPr>
-      </w:pPr>
-      <w:r>
-        <w:rPr>
-          <w:rFonts w:hint="default" w:ascii="Trebuchet MS" w:hAnsi="Trebuchet MS" w:eastAsia="SimSun" w:cs="Trebuchet MS"/>
-          <w:i w:val="0"/>
-          <w:iCs w:val="0"/>
-          <w:caps w:val="0"/>
-          <w:color w:val="303030"/>
-          <w:spacing w:val="0"/>
-          <w:sz w:val="21"/>
-          <w:szCs w:val="21"/>
-          <w:shd w:val="clear" w:fill="FFFFFF"/>
-          <w:lang w:val="en-US"/>
-        </w:rPr>
-        <w:t>&lt;small&gt;&lt;/small&gt;</w:t>
-      </w:r>
-    </w:p>
-    <w:p>
-      <w:pPr>
-        <w:numPr>
-          <w:numId w:val="0"/>
-        </w:numPr>
-        <w:rPr>
-          <w:rFonts w:hint="default" w:ascii="Trebuchet MS" w:hAnsi="Trebuchet MS" w:eastAsia="SimSun" w:cs="Trebuchet MS"/>
-          <w:i w:val="0"/>
-          <w:iCs w:val="0"/>
-          <w:caps w:val="0"/>
-          <w:color w:val="303030"/>
-          <w:spacing w:val="0"/>
-          <w:sz w:val="21"/>
-          <w:szCs w:val="21"/>
-          <w:shd w:val="clear" w:fill="FFFFFF"/>
-          <w:lang w:val="en-US"/>
-        </w:rPr>
-      </w:pPr>
-      <w:r>
-        <w:rPr>
-          <w:rFonts w:hint="default" w:ascii="Trebuchet MS" w:hAnsi="Trebuchet MS" w:eastAsia="SimSun" w:cs="Trebuchet MS"/>
-          <w:i w:val="0"/>
-          <w:iCs w:val="0"/>
-          <w:caps w:val="0"/>
-          <w:color w:val="303030"/>
-          <w:spacing w:val="0"/>
-          <w:sz w:val="21"/>
-          <w:szCs w:val="21"/>
-          <w:shd w:val="clear" w:fill="FFFFFF"/>
-          <w:lang w:val="en-US"/>
-        </w:rPr>
-        <w:t>&lt;mark&gt;&lt;/mark&gt;</w:t>
-      </w:r>
-    </w:p>
-    <w:p>
-      <w:pPr>
-        <w:numPr>
-          <w:numId w:val="0"/>
-        </w:numPr>
-        <w:rPr>
-          <w:rFonts w:hint="default" w:ascii="Trebuchet MS" w:hAnsi="Trebuchet MS" w:eastAsia="SimSun" w:cs="Trebuchet MS"/>
-          <w:i w:val="0"/>
-          <w:iCs w:val="0"/>
-          <w:caps w:val="0"/>
-          <w:color w:val="303030"/>
-          <w:spacing w:val="0"/>
-          <w:sz w:val="21"/>
-          <w:szCs w:val="21"/>
-          <w:shd w:val="clear" w:fill="FFFFFF"/>
-          <w:lang w:val="en-US"/>
-        </w:rPr>
-      </w:pPr>
-      <w:r>
-        <w:rPr>
-          <w:rFonts w:hint="default" w:ascii="Trebuchet MS" w:hAnsi="Trebuchet MS" w:eastAsia="SimSun" w:cs="Trebuchet MS"/>
-          <w:i w:val="0"/>
-          <w:iCs w:val="0"/>
-          <w:caps w:val="0"/>
-          <w:color w:val="303030"/>
-          <w:spacing w:val="0"/>
-          <w:sz w:val="21"/>
-          <w:szCs w:val="21"/>
-          <w:shd w:val="clear" w:fill="FFFFFF"/>
-          <w:lang w:val="en-US"/>
-        </w:rPr>
-        <w:t>&lt;span&gt;&lt;/span&gt;</w:t>
-      </w:r>
-    </w:p>
-    <w:p>
-      <w:pPr>
-        <w:numPr>
-          <w:numId w:val="0"/>
-        </w:numPr>
-        <w:rPr>
-          <w:rFonts w:hint="default" w:ascii="Trebuchet MS" w:hAnsi="Trebuchet MS" w:eastAsia="SimSun" w:cs="Trebuchet MS"/>
-          <w:i w:val="0"/>
-          <w:iCs w:val="0"/>
-          <w:caps w:val="0"/>
-          <w:color w:val="303030"/>
-          <w:spacing w:val="0"/>
-          <w:sz w:val="21"/>
-          <w:szCs w:val="21"/>
-          <w:shd w:val="clear" w:fill="FFFFFF"/>
-          <w:lang w:val="ru-RU"/>
-        </w:rPr>
-      </w:pPr>
-      <w:r>
-        <w:rPr>
-          <w:rFonts w:hint="default" w:ascii="Trebuchet MS" w:hAnsi="Trebuchet MS" w:eastAsia="SimSun" w:cs="Trebuchet MS"/>
-          <w:i w:val="0"/>
-          <w:iCs w:val="0"/>
-          <w:color w:val="303030"/>
-          <w:spacing w:val="0"/>
-          <w:sz w:val="21"/>
-          <w:szCs w:val="21"/>
-          <w:shd w:val="clear" w:fill="FFFFFF"/>
-          <w:lang w:val="en-US"/>
-        </w:rPr>
-        <w:t>H</w:t>
-      </w:r>
-      <w:r>
-        <w:rPr>
-          <w:rFonts w:hint="default" w:ascii="Trebuchet MS" w:hAnsi="Trebuchet MS" w:eastAsia="SimSun" w:cs="Trebuchet MS"/>
-          <w:i w:val="0"/>
-          <w:iCs w:val="0"/>
-          <w:caps w:val="0"/>
-          <w:color w:val="303030"/>
-          <w:spacing w:val="0"/>
-          <w:sz w:val="21"/>
-          <w:szCs w:val="21"/>
-          <w:shd w:val="clear" w:fill="FFFFFF"/>
-          <w:lang w:val="en-US"/>
-        </w:rPr>
-        <w:t xml:space="preserve">1-H6 - </w:t>
-      </w:r>
-      <w:r>
-        <w:rPr>
-          <w:rFonts w:ascii="Trebuchet MS" w:hAnsi="Trebuchet MS" w:eastAsia="SimSun" w:cs="Trebuchet MS"/>
-          <w:i w:val="0"/>
-          <w:iCs w:val="0"/>
-          <w:caps w:val="0"/>
-          <w:color w:val="303030"/>
-          <w:spacing w:val="0"/>
-          <w:sz w:val="21"/>
-          <w:szCs w:val="21"/>
-          <w:shd w:val="clear" w:fill="FFFFFF"/>
-        </w:rPr>
-        <w:t>Создают заголовки шести уровней для связанных с ними разделов</w:t>
-      </w:r>
-      <w:r>
-        <w:rPr>
-          <w:rFonts w:hint="default" w:ascii="Trebuchet MS" w:hAnsi="Trebuchet MS" w:eastAsia="SimSun" w:cs="Trebuchet MS"/>
-          <w:i w:val="0"/>
-          <w:iCs w:val="0"/>
-          <w:caps w:val="0"/>
-          <w:color w:val="303030"/>
-          <w:spacing w:val="0"/>
-          <w:sz w:val="21"/>
-          <w:szCs w:val="21"/>
-          <w:shd w:val="clear" w:fill="FFFFFF"/>
-          <w:lang w:val="ru-RU"/>
-        </w:rPr>
-        <w:t>.</w:t>
-      </w:r>
-    </w:p>
-    <w:p>
-      <w:pPr>
-        <w:numPr>
-          <w:numId w:val="0"/>
-        </w:numPr>
-        <w:rPr>
-          <w:rFonts w:hint="default" w:ascii="Trebuchet MS" w:hAnsi="Trebuchet MS" w:eastAsia="SimSun" w:cs="Trebuchet MS"/>
-          <w:i w:val="0"/>
-          <w:iCs w:val="0"/>
-          <w:caps w:val="0"/>
-          <w:color w:val="303030"/>
-          <w:spacing w:val="0"/>
-          <w:sz w:val="21"/>
-          <w:szCs w:val="21"/>
-          <w:shd w:val="clear" w:fill="FFFFFF"/>
-          <w:lang w:val="ru-RU"/>
-        </w:rPr>
-      </w:pPr>
-      <w:r>
-        <w:rPr>
-          <w:rFonts w:hint="default" w:ascii="Trebuchet MS" w:hAnsi="Trebuchet MS" w:eastAsia="SimSun" w:cs="Trebuchet MS"/>
-          <w:i w:val="0"/>
-          <w:iCs w:val="0"/>
-          <w:caps w:val="0"/>
-          <w:color w:val="303030"/>
-          <w:spacing w:val="0"/>
-          <w:sz w:val="21"/>
-          <w:szCs w:val="21"/>
-          <w:shd w:val="clear" w:fill="FFFFFF"/>
-          <w:lang w:val="en-US"/>
-        </w:rPr>
-        <w:t xml:space="preserve">H1 - </w:t>
-      </w:r>
-      <w:r>
-        <w:rPr>
-          <w:rFonts w:hint="default" w:ascii="Trebuchet MS" w:hAnsi="Trebuchet MS" w:eastAsia="SimSun" w:cs="Trebuchet MS"/>
-          <w:i w:val="0"/>
-          <w:iCs w:val="0"/>
-          <w:caps w:val="0"/>
-          <w:color w:val="303030"/>
-          <w:spacing w:val="0"/>
-          <w:sz w:val="21"/>
-          <w:szCs w:val="21"/>
-          <w:shd w:val="clear" w:fill="FFFFFF"/>
-          <w:lang w:val="ru-RU"/>
-        </w:rPr>
-        <w:t>должен быть 1 на странице</w:t>
-      </w:r>
-    </w:p>
-    <w:p>
-      <w:pPr>
-        <w:numPr>
-          <w:numId w:val="0"/>
-        </w:numPr>
-        <w:rPr>
-          <w:rFonts w:hint="default" w:ascii="Trebuchet MS" w:hAnsi="Trebuchet MS" w:eastAsia="SimSun" w:cs="Trebuchet MS"/>
-          <w:i w:val="0"/>
-          <w:iCs w:val="0"/>
-          <w:caps w:val="0"/>
-          <w:color w:val="303030"/>
-          <w:spacing w:val="0"/>
-          <w:sz w:val="21"/>
-          <w:szCs w:val="21"/>
-          <w:shd w:val="clear" w:fill="FFFFFF"/>
-          <w:lang w:val="ru-RU"/>
-        </w:rPr>
-      </w:pPr>
-    </w:p>
-    <w:p>
-      <w:pPr>
-        <w:numPr>
-          <w:numId w:val="0"/>
-        </w:numPr>
-        <w:rPr>
-          <w:rFonts w:ascii="Trebuchet MS" w:hAnsi="Trebuchet MS" w:eastAsia="SimSun" w:cs="Trebuchet MS"/>
-          <w:i w:val="0"/>
-          <w:iCs w:val="0"/>
-          <w:caps w:val="0"/>
-          <w:color w:val="303030"/>
-          <w:spacing w:val="0"/>
-          <w:sz w:val="21"/>
-          <w:szCs w:val="21"/>
-          <w:shd w:val="clear" w:fill="FFFFFF"/>
-        </w:rPr>
-      </w:pPr>
-      <w:r>
-        <w:rPr>
-          <w:rFonts w:hint="default" w:ascii="Trebuchet MS" w:hAnsi="Trebuchet MS" w:eastAsia="SimSun" w:cs="Trebuchet MS"/>
-          <w:i w:val="0"/>
-          <w:iCs w:val="0"/>
-          <w:caps w:val="0"/>
-          <w:color w:val="303030"/>
-          <w:spacing w:val="0"/>
-          <w:sz w:val="21"/>
-          <w:szCs w:val="21"/>
-          <w:shd w:val="clear" w:fill="FFFFFF"/>
-          <w:lang w:val="en-US"/>
-        </w:rPr>
-        <w:t xml:space="preserve">&lt;a&gt; </w:t>
-      </w:r>
-      <w:r>
-        <w:rPr>
-          <w:rFonts w:ascii="Trebuchet MS" w:hAnsi="Trebuchet MS" w:eastAsia="SimSun" w:cs="Trebuchet MS"/>
-          <w:i w:val="0"/>
-          <w:iCs w:val="0"/>
-          <w:caps w:val="0"/>
-          <w:color w:val="303030"/>
-          <w:spacing w:val="0"/>
-          <w:sz w:val="21"/>
-          <w:szCs w:val="21"/>
-          <w:shd w:val="clear" w:fill="FFFFFF"/>
-        </w:rPr>
-        <w:t>Создаёт гипертекстовые ссылки.</w:t>
-      </w:r>
-    </w:p>
-    <w:p>
-      <w:pPr>
-        <w:numPr>
-          <w:numId w:val="0"/>
-        </w:numPr>
-        <w:rPr>
-          <w:rFonts w:hint="default" w:ascii="Trebuchet MS" w:hAnsi="Trebuchet MS" w:eastAsia="SimSun" w:cs="Trebuchet MS"/>
-          <w:i w:val="0"/>
-          <w:iCs w:val="0"/>
-          <w:caps w:val="0"/>
-          <w:color w:val="303030"/>
-          <w:spacing w:val="0"/>
-          <w:sz w:val="21"/>
-          <w:szCs w:val="21"/>
-          <w:shd w:val="clear" w:fill="FFFFFF"/>
-          <w:lang w:val="en-US"/>
-        </w:rPr>
-      </w:pPr>
+          <w:lang w:val="ru-RU"/>
+        </w:rPr>
+        <w:t xml:space="preserve">Комменты в </w:t>
+      </w:r>
+      <w:r>
+        <w:rPr>
+          <w:rFonts w:hint="default" w:ascii="Trebuchet MS" w:hAnsi="Trebuchet MS" w:eastAsia="SimSun" w:cs="Trebuchet MS"/>
+          <w:i w:val="0"/>
+          <w:iCs w:val="0"/>
+          <w:caps w:val="0"/>
+          <w:color w:val="303030"/>
+          <w:spacing w:val="0"/>
+          <w:sz w:val="21"/>
+          <w:szCs w:val="21"/>
+          <w:shd w:val="clear" w:fill="FFFFFF"/>
+          <w:lang w:val="en-US"/>
+        </w:rPr>
+        <w:t xml:space="preserve">CSS </w:t>
+      </w:r>
+      <w:r>
+        <w:rPr>
+          <w:rFonts w:hint="default" w:ascii="Trebuchet MS" w:hAnsi="Trebuchet MS" w:eastAsia="SimSun" w:cs="Trebuchet MS"/>
+          <w:i w:val="0"/>
+          <w:iCs w:val="0"/>
+          <w:caps w:val="0"/>
+          <w:color w:val="303030"/>
+          <w:spacing w:val="0"/>
+          <w:sz w:val="21"/>
+          <w:szCs w:val="21"/>
+          <w:shd w:val="clear" w:fill="FFFFFF"/>
+          <w:lang w:val="ru-RU"/>
+        </w:rPr>
+        <w:t xml:space="preserve">пишутся через </w:t>
+      </w:r>
+      <w:r>
+        <w:rPr>
+          <w:rFonts w:hint="default" w:ascii="Trebuchet MS" w:hAnsi="Trebuchet MS" w:eastAsia="SimSun" w:cs="Trebuchet MS"/>
+          <w:i w:val="0"/>
+          <w:iCs w:val="0"/>
+          <w:caps w:val="0"/>
+          <w:color w:val="303030"/>
+          <w:spacing w:val="0"/>
+          <w:sz w:val="21"/>
+          <w:szCs w:val="21"/>
+          <w:shd w:val="clear" w:fill="FFFFFF"/>
+          <w:lang w:val="en-US"/>
+        </w:rPr>
+        <w:t>/* ---- */</w:t>
+      </w:r>
       <w:bookmarkStart w:id="2" w:name="_GoBack"/>
       <w:bookmarkEnd w:id="2"/>
     </w:p>
@@ -3382,6 +4825,18 @@
 <file path=word/numbering.xml><?xml version="1.0" encoding="utf-8"?>
 <w:numbering xmlns:wpc="http://schemas.microsoft.com/office/word/2010/wordprocessingCanvas" xmlns:mc="http://schemas.openxmlformats.org/markup-compatibility/2006" xmlns:o="urn:schemas-microsoft-com:office:office" xmlns:r="http://schemas.openxmlformats.org/officeDocument/2006/relationships" xmlns:m="http://schemas.openxmlformats.org/officeDocument/2006/math" xmlns:v="urn:schemas-microsoft-com:vml" xmlns:wp14="http://schemas.microsoft.com/office/word/2010/wordprocessingDrawing" xmlns:wp="http://schemas.openxmlformats.org/drawingml/2006/wordprocessingDrawing" xmlns:w10="urn:schemas-microsoft-com:office:word" xmlns:w="http://schemas.openxmlformats.org/wordprocessingml/2006/main" xmlns:w14="http://schemas.microsoft.com/office/word/2010/wordml" xmlns:wpg="http://schemas.microsoft.com/office/word/2010/wordprocessingGroup" xmlns:wpi="http://schemas.microsoft.com/office/word/2010/wordprocessingInk" xmlns:wne="http://schemas.microsoft.com/office/word/2006/wordml" xmlns:wps="http://schemas.microsoft.com/office/word/2010/wordprocessingShape" xmlns:wpsCustomData="http://www.wps.cn/officeDocument/2013/wpsCustomData" mc:Ignorable="w14 wp14">
   <w:abstractNum w:abstractNumId="0">
+    <w:nsid w:val="09232D77"/>
+    <w:multiLevelType w:val="singleLevel"/>
+    <w:tmpl w:val="09232D77"/>
+    <w:lvl w:ilvl="0" w:tentative="0">
+      <w:start w:val="1"/>
+      <w:numFmt w:val="decimal"/>
+      <w:suff w:val="space"/>
+      <w:lvlText w:val="%1."/>
+      <w:lvlJc w:val="left"/>
+    </w:lvl>
+  </w:abstractNum>
+  <w:abstractNum w:abstractNumId="1">
     <w:nsid w:val="657A79ED"/>
     <w:multiLevelType w:val="singleLevel"/>
     <w:tmpl w:val="657A79ED"/>
@@ -3394,6 +4849,9 @@
     </w:lvl>
   </w:abstractNum>
   <w:num w:numId="1">
+    <w:abstractNumId w:val="1"/>
+  </w:num>
+  <w:num w:numId="2">
     <w:abstractNumId w:val="0"/>
   </w:num>
 </w:numbering>
@@ -3475,7 +4933,7 @@
     <w:lsdException w:qFormat="1" w:unhideWhenUsed="0" w:uiPriority="0" w:semiHidden="0" w:name="Title"/>
     <w:lsdException w:unhideWhenUsed="0" w:uiPriority="0" w:semiHidden="0" w:name="Closing"/>
     <w:lsdException w:unhideWhenUsed="0" w:uiPriority="0" w:semiHidden="0" w:name="Signature"/>
-    <w:lsdException w:unhideWhenUsed="0" w:uiPriority="0" w:name="Default Paragraph Font"/>
+    <w:lsdException w:qFormat="1" w:unhideWhenUsed="0" w:uiPriority="0" w:name="Default Paragraph Font"/>
     <w:lsdException w:unhideWhenUsed="0" w:uiPriority="0" w:semiHidden="0" w:name="Body Text"/>
     <w:lsdException w:unhideWhenUsed="0" w:uiPriority="0" w:semiHidden="0" w:name="Body Text Indent"/>
     <w:lsdException w:unhideWhenUsed="0" w:uiPriority="0" w:semiHidden="0" w:name="List Continue"/>
@@ -3581,6 +5039,7 @@
   <w:style w:type="character" w:default="1" w:styleId="2">
     <w:name w:val="Default Paragraph Font"/>
     <w:semiHidden/>
+    <w:qFormat/>
     <w:uiPriority w:val="0"/>
   </w:style>
   <w:style w:type="table" w:default="1" w:styleId="3">

</xml_diff>